<commit_message>
Remove obsolete proposal render artifacts
</commit_message>
<xml_diff>
--- a/docs/proposal/ABL_Operational_Blueprinting_Application_Build_Extension_v3.docx
+++ b/docs/proposal/ABL_Operational_Blueprinting_Application_Build_Extension_v3.docx
@@ -818,6 +818,29 @@
           <w:sz w:val="18"/>
         </w:rPr>
         <w:t>Reference Inputs</w:t>
+      </w:r>
+    </w:p>
+    <w:p>
+      <w:pPr>
+        <w:spacing w:after="60"/>
+        <w:ind w:left="720" w:hanging="533"/>
+      </w:pPr>
+      <w:r>
+        <w:rPr>
+          <w:rFonts w:ascii="Aptos" w:hAnsi="Aptos"/>
+          <w:color w:val="232B34"/>
+          <w:sz w:val="18"/>
+        </w:rPr>
+        <w:t>16.</w:t>
+      </w:r>
+      <w:r>
+        <w:rPr>
+          <w:rFonts w:ascii="Aptos" w:hAnsi="Aptos"/>
+          <w:color w:val="232B34"/>
+          <w:sz w:val="18"/>
+        </w:rPr>
+        <w:tab/>
+        <w:t>Glossary</w:t>
       </w:r>
     </w:p>
     <w:p>
@@ -9230,6 +9253,2993 @@
       </w:pPr>
       <w:r>
         <w:t>the product-development direction for the ABL flow-management platform.</w:t>
+      </w:r>
+    </w:p>
+    <w:p>
+      <w:r>
+        <w:br w:type="page"/>
+      </w:r>
+    </w:p>
+    <w:p>
+      <w:pPr>
+        <w:pStyle w:val="Heading1"/>
+      </w:pPr>
+      <w:r>
+        <w:rPr>
+          <w:rFonts w:ascii="Aptos Display" w:hAnsi="Aptos Display"/>
+          <w:color w:val="276FB2"/>
+          <w:sz w:val="48"/>
+        </w:rPr>
+        <w:lastRenderedPageBreak/>
+        <w:t>16. Glossary</w:t>
+      </w:r>
+    </w:p>
+    <w:p>
+      <w:pPr>
+        <w:spacing w:line="259" w:lineRule="auto"/>
+      </w:pPr>
+      <w:r>
+        <w:rPr>
+          <w:rFonts w:ascii="Aptos" w:hAnsi="Aptos"/>
+          <w:color w:val="232B34"/>
+          <w:sz w:val="18"/>
+        </w:rPr>
+        <w:t>The following glossary defines the operating and product terms used in this application build extension.</w:t>
+      </w:r>
+    </w:p>
+    <w:tbl>
+      <w:tblPr>
+        <w:tblW w:w="9360" w:type="dxa"/>
+        <w:tblInd w:w="120" w:type="dxa"/>
+        <w:tblLayout w:type="fixed"/>
+        <w:tblLook w:val="04A0" w:firstRow="1" w:lastRow="0" w:firstColumn="1" w:lastColumn="0" w:noHBand="0" w:noVBand="1"/>
+      </w:tblPr>
+      <w:tblGrid>
+        <w:gridCol w:w="2500"/>
+        <w:gridCol w:w="6860"/>
+      </w:tblGrid>
+      <w:tr>
+        <w:trPr>
+          <w:cantSplit/>
+          <w:tblHeader/>
+        </w:trPr>
+        <w:tc>
+          <w:tcPr>
+            <w:tcW w:w="2500" w:type="dxa"/>
+            <w:tcBorders>
+              <w:top w:val="single" w:sz="6" w:space="0" w:color="D2DAE5"/>
+              <w:left w:val="single" w:sz="6" w:space="0" w:color="D2DAE5"/>
+              <w:bottom w:val="single" w:sz="6" w:space="0" w:color="D2DAE5"/>
+              <w:right w:val="single" w:sz="6" w:space="0" w:color="D2DAE5"/>
+            </w:tcBorders>
+            <w:shd w:val="clear" w:color="auto" w:fill="E6EDF5"/>
+            <w:tcMar>
+              <w:top w:w="80" w:type="dxa"/>
+              <w:left w:w="110" w:type="dxa"/>
+              <w:bottom w:w="80" w:type="dxa"/>
+              <w:right w:w="110" w:type="dxa"/>
+            </w:tcMar>
+            <w:vAlign w:val="center"/>
+          </w:tcPr>
+          <w:p>
+            <w:pPr>
+              <w:spacing w:after="0" w:line="247" w:lineRule="auto"/>
+            </w:pPr>
+            <w:r>
+              <w:rPr>
+                <w:rFonts w:ascii="Aptos" w:hAnsi="Aptos"/>
+                <w:b/>
+                <w:color w:val="14375C"/>
+                <w:sz w:val="17"/>
+              </w:rPr>
+              <w:t>Term</w:t>
+            </w:r>
+          </w:p>
+        </w:tc>
+        <w:tc>
+          <w:tcPr>
+            <w:tcW w:w="6860" w:type="dxa"/>
+            <w:tcBorders>
+              <w:top w:val="single" w:sz="6" w:space="0" w:color="D2DAE5"/>
+              <w:left w:val="single" w:sz="6" w:space="0" w:color="D2DAE5"/>
+              <w:bottom w:val="single" w:sz="6" w:space="0" w:color="D2DAE5"/>
+              <w:right w:val="single" w:sz="6" w:space="0" w:color="D2DAE5"/>
+            </w:tcBorders>
+            <w:shd w:val="clear" w:color="auto" w:fill="E6EDF5"/>
+            <w:tcMar>
+              <w:top w:w="80" w:type="dxa"/>
+              <w:left w:w="110" w:type="dxa"/>
+              <w:bottom w:w="80" w:type="dxa"/>
+              <w:right w:w="110" w:type="dxa"/>
+            </w:tcMar>
+            <w:vAlign w:val="center"/>
+          </w:tcPr>
+          <w:p>
+            <w:pPr>
+              <w:spacing w:after="0" w:line="247" w:lineRule="auto"/>
+            </w:pPr>
+            <w:r>
+              <w:rPr>
+                <w:rFonts w:ascii="Aptos" w:hAnsi="Aptos"/>
+                <w:b/>
+                <w:color w:val="14375C"/>
+                <w:sz w:val="17"/>
+              </w:rPr>
+              <w:t>Definition in this proposal context</w:t>
+            </w:r>
+          </w:p>
+        </w:tc>
+      </w:tr>
+      <w:tr>
+        <w:trPr>
+          <w:cantSplit/>
+        </w:trPr>
+        <w:tc>
+          <w:tcPr>
+            <w:tcW w:w="2500" w:type="dxa"/>
+            <w:tcBorders>
+              <w:top w:val="single" w:sz="6" w:space="0" w:color="D2DAE5"/>
+              <w:left w:val="single" w:sz="6" w:space="0" w:color="D2DAE5"/>
+              <w:bottom w:val="single" w:sz="6" w:space="0" w:color="D2DAE5"/>
+              <w:right w:val="single" w:sz="6" w:space="0" w:color="D2DAE5"/>
+            </w:tcBorders>
+            <w:tcMar>
+              <w:top w:w="80" w:type="dxa"/>
+              <w:left w:w="110" w:type="dxa"/>
+              <w:bottom w:w="80" w:type="dxa"/>
+              <w:right w:w="110" w:type="dxa"/>
+            </w:tcMar>
+            <w:vAlign w:val="center"/>
+          </w:tcPr>
+          <w:p>
+            <w:pPr>
+              <w:spacing w:after="0" w:line="247" w:lineRule="auto"/>
+            </w:pPr>
+            <w:r>
+              <w:rPr>
+                <w:rFonts w:ascii="Aptos" w:hAnsi="Aptos"/>
+                <w:b/>
+                <w:color w:val="232B34"/>
+                <w:sz w:val="16"/>
+              </w:rPr>
+              <w:t>ABL</w:t>
+            </w:r>
+          </w:p>
+        </w:tc>
+        <w:tc>
+          <w:tcPr>
+            <w:tcW w:w="6860" w:type="dxa"/>
+            <w:tcBorders>
+              <w:top w:val="single" w:sz="6" w:space="0" w:color="D2DAE5"/>
+              <w:left w:val="single" w:sz="6" w:space="0" w:color="D2DAE5"/>
+              <w:bottom w:val="single" w:sz="6" w:space="0" w:color="D2DAE5"/>
+              <w:right w:val="single" w:sz="6" w:space="0" w:color="D2DAE5"/>
+            </w:tcBorders>
+            <w:tcMar>
+              <w:top w:w="80" w:type="dxa"/>
+              <w:left w:w="110" w:type="dxa"/>
+              <w:bottom w:w="80" w:type="dxa"/>
+              <w:right w:w="110" w:type="dxa"/>
+            </w:tcMar>
+            <w:vAlign w:val="center"/>
+          </w:tcPr>
+          <w:p>
+            <w:pPr>
+              <w:spacing w:after="0" w:line="247" w:lineRule="auto"/>
+            </w:pPr>
+            <w:r>
+              <w:rPr>
+                <w:rFonts w:ascii="Aptos" w:hAnsi="Aptos"/>
+                <w:color w:val="232B34"/>
+                <w:sz w:val="16"/>
+              </w:rPr>
+              <w:t>The operating organization for the transshipment flow being planned across fleet, port, barging, CTS and OGV loading operations.</w:t>
+            </w:r>
+          </w:p>
+        </w:tc>
+      </w:tr>
+      <w:tr>
+        <w:trPr>
+          <w:cantSplit/>
+        </w:trPr>
+        <w:tc>
+          <w:tcPr>
+            <w:tcW w:w="2500" w:type="dxa"/>
+            <w:tcBorders>
+              <w:top w:val="single" w:sz="6" w:space="0" w:color="D2DAE5"/>
+              <w:left w:val="single" w:sz="6" w:space="0" w:color="D2DAE5"/>
+              <w:bottom w:val="single" w:sz="6" w:space="0" w:color="D2DAE5"/>
+              <w:right w:val="single" w:sz="6" w:space="0" w:color="D2DAE5"/>
+            </w:tcBorders>
+            <w:tcMar>
+              <w:top w:w="80" w:type="dxa"/>
+              <w:left w:w="110" w:type="dxa"/>
+              <w:bottom w:w="80" w:type="dxa"/>
+              <w:right w:w="110" w:type="dxa"/>
+            </w:tcMar>
+            <w:vAlign w:val="center"/>
+          </w:tcPr>
+          <w:p>
+            <w:pPr>
+              <w:spacing w:after="0" w:line="247" w:lineRule="auto"/>
+            </w:pPr>
+            <w:r>
+              <w:rPr>
+                <w:rFonts w:ascii="Aptos" w:hAnsi="Aptos"/>
+                <w:b/>
+                <w:color w:val="232B34"/>
+                <w:sz w:val="16"/>
+              </w:rPr>
+              <w:t>Berau Coal</w:t>
+            </w:r>
+          </w:p>
+        </w:tc>
+        <w:tc>
+          <w:tcPr>
+            <w:tcW w:w="6860" w:type="dxa"/>
+            <w:tcBorders>
+              <w:top w:val="single" w:sz="6" w:space="0" w:color="D2DAE5"/>
+              <w:left w:val="single" w:sz="6" w:space="0" w:color="D2DAE5"/>
+              <w:bottom w:val="single" w:sz="6" w:space="0" w:color="D2DAE5"/>
+              <w:right w:val="single" w:sz="6" w:space="0" w:color="D2DAE5"/>
+            </w:tcBorders>
+            <w:tcMar>
+              <w:top w:w="80" w:type="dxa"/>
+              <w:left w:w="110" w:type="dxa"/>
+              <w:bottom w:w="80" w:type="dxa"/>
+              <w:right w:w="110" w:type="dxa"/>
+            </w:tcMar>
+            <w:vAlign w:val="center"/>
+          </w:tcPr>
+          <w:p>
+            <w:pPr>
+              <w:spacing w:after="0" w:line="247" w:lineRule="auto"/>
+            </w:pPr>
+            <w:r>
+              <w:rPr>
+                <w:rFonts w:ascii="Aptos" w:hAnsi="Aptos"/>
+                <w:color w:val="232B34"/>
+                <w:sz w:val="16"/>
+              </w:rPr>
+              <w:t>The shipment-demand and cargo-context party whose OGV requirements, cargo quantity, grade and sequence drive the planning flow.</w:t>
+            </w:r>
+          </w:p>
+        </w:tc>
+      </w:tr>
+      <w:tr>
+        <w:trPr>
+          <w:cantSplit/>
+        </w:trPr>
+        <w:tc>
+          <w:tcPr>
+            <w:tcW w:w="2500" w:type="dxa"/>
+            <w:tcBorders>
+              <w:top w:val="single" w:sz="6" w:space="0" w:color="D2DAE5"/>
+              <w:left w:val="single" w:sz="6" w:space="0" w:color="D2DAE5"/>
+              <w:bottom w:val="single" w:sz="6" w:space="0" w:color="D2DAE5"/>
+              <w:right w:val="single" w:sz="6" w:space="0" w:color="D2DAE5"/>
+            </w:tcBorders>
+            <w:tcMar>
+              <w:top w:w="80" w:type="dxa"/>
+              <w:left w:w="110" w:type="dxa"/>
+              <w:bottom w:w="80" w:type="dxa"/>
+              <w:right w:w="110" w:type="dxa"/>
+            </w:tcMar>
+            <w:vAlign w:val="center"/>
+          </w:tcPr>
+          <w:p>
+            <w:pPr>
+              <w:spacing w:after="0" w:line="247" w:lineRule="auto"/>
+            </w:pPr>
+            <w:r>
+              <w:rPr>
+                <w:rFonts w:ascii="Aptos" w:hAnsi="Aptos"/>
+                <w:b/>
+                <w:color w:val="232B34"/>
+                <w:sz w:val="16"/>
+              </w:rPr>
+              <w:t>Operational Blueprinting</w:t>
+            </w:r>
+          </w:p>
+        </w:tc>
+        <w:tc>
+          <w:tcPr>
+            <w:tcW w:w="6860" w:type="dxa"/>
+            <w:tcBorders>
+              <w:top w:val="single" w:sz="6" w:space="0" w:color="D2DAE5"/>
+              <w:left w:val="single" w:sz="6" w:space="0" w:color="D2DAE5"/>
+              <w:bottom w:val="single" w:sz="6" w:space="0" w:color="D2DAE5"/>
+              <w:right w:val="single" w:sz="6" w:space="0" w:color="D2DAE5"/>
+            </w:tcBorders>
+            <w:tcMar>
+              <w:top w:w="80" w:type="dxa"/>
+              <w:left w:w="110" w:type="dxa"/>
+              <w:bottom w:w="80" w:type="dxa"/>
+              <w:right w:w="110" w:type="dxa"/>
+            </w:tcMar>
+            <w:vAlign w:val="center"/>
+          </w:tcPr>
+          <w:p>
+            <w:pPr>
+              <w:spacing w:after="0" w:line="247" w:lineRule="auto"/>
+            </w:pPr>
+            <w:r>
+              <w:rPr>
+                <w:rFonts w:ascii="Aptos" w:hAnsi="Aptos"/>
+                <w:color w:val="232B34"/>
+                <w:sz w:val="16"/>
+              </w:rPr>
+              <w:t>The validation of operating logic, data assumptions, decision workflows and implementation priorities before the application build.</w:t>
+            </w:r>
+          </w:p>
+        </w:tc>
+      </w:tr>
+      <w:tr>
+        <w:trPr>
+          <w:cantSplit/>
+        </w:trPr>
+        <w:tc>
+          <w:tcPr>
+            <w:tcW w:w="2500" w:type="dxa"/>
+            <w:tcBorders>
+              <w:top w:val="single" w:sz="6" w:space="0" w:color="D2DAE5"/>
+              <w:left w:val="single" w:sz="6" w:space="0" w:color="D2DAE5"/>
+              <w:bottom w:val="single" w:sz="6" w:space="0" w:color="D2DAE5"/>
+              <w:right w:val="single" w:sz="6" w:space="0" w:color="D2DAE5"/>
+            </w:tcBorders>
+            <w:tcMar>
+              <w:top w:w="80" w:type="dxa"/>
+              <w:left w:w="110" w:type="dxa"/>
+              <w:bottom w:w="80" w:type="dxa"/>
+              <w:right w:w="110" w:type="dxa"/>
+            </w:tcMar>
+            <w:vAlign w:val="center"/>
+          </w:tcPr>
+          <w:p>
+            <w:pPr>
+              <w:spacing w:after="0" w:line="247" w:lineRule="auto"/>
+            </w:pPr>
+            <w:r>
+              <w:rPr>
+                <w:rFonts w:ascii="Aptos" w:hAnsi="Aptos"/>
+                <w:b/>
+                <w:color w:val="232B34"/>
+                <w:sz w:val="16"/>
+              </w:rPr>
+              <w:t>Application Build Extension</w:t>
+            </w:r>
+          </w:p>
+        </w:tc>
+        <w:tc>
+          <w:tcPr>
+            <w:tcW w:w="6860" w:type="dxa"/>
+            <w:tcBorders>
+              <w:top w:val="single" w:sz="6" w:space="0" w:color="D2DAE5"/>
+              <w:left w:val="single" w:sz="6" w:space="0" w:color="D2DAE5"/>
+              <w:bottom w:val="single" w:sz="6" w:space="0" w:color="D2DAE5"/>
+              <w:right w:val="single" w:sz="6" w:space="0" w:color="D2DAE5"/>
+            </w:tcBorders>
+            <w:tcMar>
+              <w:top w:w="80" w:type="dxa"/>
+              <w:left w:w="110" w:type="dxa"/>
+              <w:bottom w:w="80" w:type="dxa"/>
+              <w:right w:w="110" w:type="dxa"/>
+            </w:tcMar>
+            <w:vAlign w:val="center"/>
+          </w:tcPr>
+          <w:p>
+            <w:pPr>
+              <w:spacing w:after="0" w:line="247" w:lineRule="auto"/>
+            </w:pPr>
+            <w:r>
+              <w:rPr>
+                <w:rFonts w:ascii="Aptos" w:hAnsi="Aptos"/>
+                <w:color w:val="232B34"/>
+                <w:sz w:val="16"/>
+              </w:rPr>
+              <w:t>The proposal extension that explains how the validated blueprint will be translated into a phased product build.</w:t>
+            </w:r>
+          </w:p>
+        </w:tc>
+      </w:tr>
+      <w:tr>
+        <w:trPr>
+          <w:cantSplit/>
+        </w:trPr>
+        <w:tc>
+          <w:tcPr>
+            <w:tcW w:w="2500" w:type="dxa"/>
+            <w:tcBorders>
+              <w:top w:val="single" w:sz="6" w:space="0" w:color="D2DAE5"/>
+              <w:left w:val="single" w:sz="6" w:space="0" w:color="D2DAE5"/>
+              <w:bottom w:val="single" w:sz="6" w:space="0" w:color="D2DAE5"/>
+              <w:right w:val="single" w:sz="6" w:space="0" w:color="D2DAE5"/>
+            </w:tcBorders>
+            <w:tcMar>
+              <w:top w:w="80" w:type="dxa"/>
+              <w:left w:w="110" w:type="dxa"/>
+              <w:bottom w:w="80" w:type="dxa"/>
+              <w:right w:w="110" w:type="dxa"/>
+            </w:tcMar>
+            <w:vAlign w:val="center"/>
+          </w:tcPr>
+          <w:p>
+            <w:pPr>
+              <w:spacing w:after="0" w:line="247" w:lineRule="auto"/>
+            </w:pPr>
+            <w:r>
+              <w:rPr>
+                <w:rFonts w:ascii="Aptos" w:hAnsi="Aptos"/>
+                <w:b/>
+                <w:color w:val="232B34"/>
+                <w:sz w:val="16"/>
+              </w:rPr>
+              <w:t>Dynamic Operational Synchronization &amp; Scheduling Platform</w:t>
+            </w:r>
+          </w:p>
+        </w:tc>
+        <w:tc>
+          <w:tcPr>
+            <w:tcW w:w="6860" w:type="dxa"/>
+            <w:tcBorders>
+              <w:top w:val="single" w:sz="6" w:space="0" w:color="D2DAE5"/>
+              <w:left w:val="single" w:sz="6" w:space="0" w:color="D2DAE5"/>
+              <w:bottom w:val="single" w:sz="6" w:space="0" w:color="D2DAE5"/>
+              <w:right w:val="single" w:sz="6" w:space="0" w:color="D2DAE5"/>
+            </w:tcBorders>
+            <w:tcMar>
+              <w:top w:w="80" w:type="dxa"/>
+              <w:left w:w="110" w:type="dxa"/>
+              <w:bottom w:w="80" w:type="dxa"/>
+              <w:right w:w="110" w:type="dxa"/>
+            </w:tcMar>
+            <w:vAlign w:val="center"/>
+          </w:tcPr>
+          <w:p>
+            <w:pPr>
+              <w:spacing w:after="0" w:line="247" w:lineRule="auto"/>
+            </w:pPr>
+            <w:r>
+              <w:rPr>
+                <w:rFonts w:ascii="Aptos" w:hAnsi="Aptos"/>
+                <w:color w:val="232B34"/>
+                <w:sz w:val="16"/>
+              </w:rPr>
+              <w:t>The proposed product that synchronizes demand, assets, operating windows, approvals and recovery decisions in one governed planning environment.</w:t>
+            </w:r>
+          </w:p>
+        </w:tc>
+      </w:tr>
+      <w:tr>
+        <w:trPr>
+          <w:cantSplit/>
+        </w:trPr>
+        <w:tc>
+          <w:tcPr>
+            <w:tcW w:w="2500" w:type="dxa"/>
+            <w:tcBorders>
+              <w:top w:val="single" w:sz="6" w:space="0" w:color="D2DAE5"/>
+              <w:left w:val="single" w:sz="6" w:space="0" w:color="D2DAE5"/>
+              <w:bottom w:val="single" w:sz="6" w:space="0" w:color="D2DAE5"/>
+              <w:right w:val="single" w:sz="6" w:space="0" w:color="D2DAE5"/>
+            </w:tcBorders>
+            <w:tcMar>
+              <w:top w:w="80" w:type="dxa"/>
+              <w:left w:w="110" w:type="dxa"/>
+              <w:bottom w:w="80" w:type="dxa"/>
+              <w:right w:w="110" w:type="dxa"/>
+            </w:tcMar>
+            <w:vAlign w:val="center"/>
+          </w:tcPr>
+          <w:p>
+            <w:pPr>
+              <w:spacing w:after="0" w:line="247" w:lineRule="auto"/>
+            </w:pPr>
+            <w:r>
+              <w:rPr>
+                <w:rFonts w:ascii="Aptos" w:hAnsi="Aptos"/>
+                <w:b/>
+                <w:color w:val="232B34"/>
+                <w:sz w:val="16"/>
+              </w:rPr>
+              <w:t>OGV</w:t>
+            </w:r>
+          </w:p>
+        </w:tc>
+        <w:tc>
+          <w:tcPr>
+            <w:tcW w:w="6860" w:type="dxa"/>
+            <w:tcBorders>
+              <w:top w:val="single" w:sz="6" w:space="0" w:color="D2DAE5"/>
+              <w:left w:val="single" w:sz="6" w:space="0" w:color="D2DAE5"/>
+              <w:bottom w:val="single" w:sz="6" w:space="0" w:color="D2DAE5"/>
+              <w:right w:val="single" w:sz="6" w:space="0" w:color="D2DAE5"/>
+            </w:tcBorders>
+            <w:tcMar>
+              <w:top w:w="80" w:type="dxa"/>
+              <w:left w:w="110" w:type="dxa"/>
+              <w:bottom w:w="80" w:type="dxa"/>
+              <w:right w:w="110" w:type="dxa"/>
+            </w:tcMar>
+            <w:vAlign w:val="center"/>
+          </w:tcPr>
+          <w:p>
+            <w:pPr>
+              <w:spacing w:after="0" w:line="247" w:lineRule="auto"/>
+            </w:pPr>
+            <w:r>
+              <w:rPr>
+                <w:rFonts w:ascii="Aptos" w:hAnsi="Aptos"/>
+                <w:color w:val="232B34"/>
+                <w:sz w:val="16"/>
+              </w:rPr>
+              <w:t>Ocean Going Vessel; the downstream vessel commitment that defines cargo demand, laycan pressure, loading sequence and completion target.</w:t>
+            </w:r>
+          </w:p>
+        </w:tc>
+      </w:tr>
+      <w:tr>
+        <w:trPr>
+          <w:cantSplit/>
+        </w:trPr>
+        <w:tc>
+          <w:tcPr>
+            <w:tcW w:w="2500" w:type="dxa"/>
+            <w:tcBorders>
+              <w:top w:val="single" w:sz="6" w:space="0" w:color="D2DAE5"/>
+              <w:left w:val="single" w:sz="6" w:space="0" w:color="D2DAE5"/>
+              <w:bottom w:val="single" w:sz="6" w:space="0" w:color="D2DAE5"/>
+              <w:right w:val="single" w:sz="6" w:space="0" w:color="D2DAE5"/>
+            </w:tcBorders>
+            <w:tcMar>
+              <w:top w:w="80" w:type="dxa"/>
+              <w:left w:w="110" w:type="dxa"/>
+              <w:bottom w:w="80" w:type="dxa"/>
+              <w:right w:w="110" w:type="dxa"/>
+            </w:tcMar>
+            <w:vAlign w:val="center"/>
+          </w:tcPr>
+          <w:p>
+            <w:pPr>
+              <w:spacing w:after="0" w:line="247" w:lineRule="auto"/>
+            </w:pPr>
+            <w:r>
+              <w:rPr>
+                <w:rFonts w:ascii="Aptos" w:hAnsi="Aptos"/>
+                <w:b/>
+                <w:color w:val="232B34"/>
+                <w:sz w:val="16"/>
+              </w:rPr>
+              <w:t>CTS</w:t>
+            </w:r>
+          </w:p>
+        </w:tc>
+        <w:tc>
+          <w:tcPr>
+            <w:tcW w:w="6860" w:type="dxa"/>
+            <w:tcBorders>
+              <w:top w:val="single" w:sz="6" w:space="0" w:color="D2DAE5"/>
+              <w:left w:val="single" w:sz="6" w:space="0" w:color="D2DAE5"/>
+              <w:bottom w:val="single" w:sz="6" w:space="0" w:color="D2DAE5"/>
+              <w:right w:val="single" w:sz="6" w:space="0" w:color="D2DAE5"/>
+            </w:tcBorders>
+            <w:tcMar>
+              <w:top w:w="80" w:type="dxa"/>
+              <w:left w:w="110" w:type="dxa"/>
+              <w:bottom w:w="80" w:type="dxa"/>
+              <w:right w:w="110" w:type="dxa"/>
+            </w:tcMar>
+            <w:vAlign w:val="center"/>
+          </w:tcPr>
+          <w:p>
+            <w:pPr>
+              <w:spacing w:after="0" w:line="247" w:lineRule="auto"/>
+            </w:pPr>
+            <w:r>
+              <w:rPr>
+                <w:rFonts w:ascii="Aptos" w:hAnsi="Aptos"/>
+                <w:color w:val="232B34"/>
+                <w:sz w:val="16"/>
+              </w:rPr>
+              <w:t>Floating transshipment asset or transshipment station used for barge discharge and OGV loading coordination.</w:t>
+            </w:r>
+          </w:p>
+        </w:tc>
+      </w:tr>
+      <w:tr>
+        <w:trPr>
+          <w:cantSplit/>
+        </w:trPr>
+        <w:tc>
+          <w:tcPr>
+            <w:tcW w:w="2500" w:type="dxa"/>
+            <w:tcBorders>
+              <w:top w:val="single" w:sz="6" w:space="0" w:color="D2DAE5"/>
+              <w:left w:val="single" w:sz="6" w:space="0" w:color="D2DAE5"/>
+              <w:bottom w:val="single" w:sz="6" w:space="0" w:color="D2DAE5"/>
+              <w:right w:val="single" w:sz="6" w:space="0" w:color="D2DAE5"/>
+            </w:tcBorders>
+            <w:tcMar>
+              <w:top w:w="80" w:type="dxa"/>
+              <w:left w:w="110" w:type="dxa"/>
+              <w:bottom w:w="80" w:type="dxa"/>
+              <w:right w:w="110" w:type="dxa"/>
+            </w:tcMar>
+            <w:vAlign w:val="center"/>
+          </w:tcPr>
+          <w:p>
+            <w:pPr>
+              <w:spacing w:after="0" w:line="247" w:lineRule="auto"/>
+            </w:pPr>
+            <w:r>
+              <w:rPr>
+                <w:rFonts w:ascii="Aptos" w:hAnsi="Aptos"/>
+                <w:b/>
+                <w:color w:val="232B34"/>
+                <w:sz w:val="16"/>
+              </w:rPr>
+              <w:t>BLC</w:t>
+            </w:r>
+          </w:p>
+        </w:tc>
+        <w:tc>
+          <w:tcPr>
+            <w:tcW w:w="6860" w:type="dxa"/>
+            <w:tcBorders>
+              <w:top w:val="single" w:sz="6" w:space="0" w:color="D2DAE5"/>
+              <w:left w:val="single" w:sz="6" w:space="0" w:color="D2DAE5"/>
+              <w:bottom w:val="single" w:sz="6" w:space="0" w:color="D2DAE5"/>
+              <w:right w:val="single" w:sz="6" w:space="0" w:color="D2DAE5"/>
+            </w:tcBorders>
+            <w:tcMar>
+              <w:top w:w="80" w:type="dxa"/>
+              <w:left w:w="110" w:type="dxa"/>
+              <w:bottom w:w="80" w:type="dxa"/>
+              <w:right w:w="110" w:type="dxa"/>
+            </w:tcMar>
+            <w:vAlign w:val="center"/>
+          </w:tcPr>
+          <w:p>
+            <w:pPr>
+              <w:spacing w:after="0" w:line="247" w:lineRule="auto"/>
+            </w:pPr>
+            <w:r>
+              <w:rPr>
+                <w:rFonts w:ascii="Aptos" w:hAnsi="Aptos"/>
+                <w:color w:val="232B34"/>
+                <w:sz w:val="16"/>
+              </w:rPr>
+              <w:t>Jetty or loading-point capability used for barge loading; final operating names and capacities will follow ABL master data.</w:t>
+            </w:r>
+          </w:p>
+        </w:tc>
+      </w:tr>
+      <w:tr>
+        <w:trPr>
+          <w:cantSplit/>
+        </w:trPr>
+        <w:tc>
+          <w:tcPr>
+            <w:tcW w:w="2500" w:type="dxa"/>
+            <w:tcBorders>
+              <w:top w:val="single" w:sz="6" w:space="0" w:color="D2DAE5"/>
+              <w:left w:val="single" w:sz="6" w:space="0" w:color="D2DAE5"/>
+              <w:bottom w:val="single" w:sz="6" w:space="0" w:color="D2DAE5"/>
+              <w:right w:val="single" w:sz="6" w:space="0" w:color="D2DAE5"/>
+            </w:tcBorders>
+            <w:tcMar>
+              <w:top w:w="80" w:type="dxa"/>
+              <w:left w:w="110" w:type="dxa"/>
+              <w:bottom w:w="80" w:type="dxa"/>
+              <w:right w:w="110" w:type="dxa"/>
+            </w:tcMar>
+            <w:vAlign w:val="center"/>
+          </w:tcPr>
+          <w:p>
+            <w:pPr>
+              <w:spacing w:after="0" w:line="247" w:lineRule="auto"/>
+            </w:pPr>
+            <w:r>
+              <w:rPr>
+                <w:rFonts w:ascii="Aptos" w:hAnsi="Aptos"/>
+                <w:b/>
+                <w:color w:val="232B34"/>
+                <w:sz w:val="16"/>
+              </w:rPr>
+              <w:t>Tug-barge set</w:t>
+            </w:r>
+          </w:p>
+        </w:tc>
+        <w:tc>
+          <w:tcPr>
+            <w:tcW w:w="6860" w:type="dxa"/>
+            <w:tcBorders>
+              <w:top w:val="single" w:sz="6" w:space="0" w:color="D2DAE5"/>
+              <w:left w:val="single" w:sz="6" w:space="0" w:color="D2DAE5"/>
+              <w:bottom w:val="single" w:sz="6" w:space="0" w:color="D2DAE5"/>
+              <w:right w:val="single" w:sz="6" w:space="0" w:color="D2DAE5"/>
+            </w:tcBorders>
+            <w:tcMar>
+              <w:top w:w="80" w:type="dxa"/>
+              <w:left w:w="110" w:type="dxa"/>
+              <w:bottom w:w="80" w:type="dxa"/>
+              <w:right w:w="110" w:type="dxa"/>
+            </w:tcMar>
+            <w:vAlign w:val="center"/>
+          </w:tcPr>
+          <w:p>
+            <w:pPr>
+              <w:spacing w:after="0" w:line="247" w:lineRule="auto"/>
+            </w:pPr>
+            <w:r>
+              <w:rPr>
+                <w:rFonts w:ascii="Aptos" w:hAnsi="Aptos"/>
+                <w:color w:val="232B34"/>
+                <w:sz w:val="16"/>
+              </w:rPr>
+              <w:t>The paired movement resource that carries cargo from jetty/loading point through river, tide, bridge and CTS/OGV steps.</w:t>
+            </w:r>
+          </w:p>
+        </w:tc>
+      </w:tr>
+      <w:tr>
+        <w:trPr>
+          <w:cantSplit/>
+        </w:trPr>
+        <w:tc>
+          <w:tcPr>
+            <w:tcW w:w="2500" w:type="dxa"/>
+            <w:tcBorders>
+              <w:top w:val="single" w:sz="6" w:space="0" w:color="D2DAE5"/>
+              <w:left w:val="single" w:sz="6" w:space="0" w:color="D2DAE5"/>
+              <w:bottom w:val="single" w:sz="6" w:space="0" w:color="D2DAE5"/>
+              <w:right w:val="single" w:sz="6" w:space="0" w:color="D2DAE5"/>
+            </w:tcBorders>
+            <w:tcMar>
+              <w:top w:w="80" w:type="dxa"/>
+              <w:left w:w="110" w:type="dxa"/>
+              <w:bottom w:w="80" w:type="dxa"/>
+              <w:right w:w="110" w:type="dxa"/>
+            </w:tcMar>
+            <w:vAlign w:val="center"/>
+          </w:tcPr>
+          <w:p>
+            <w:pPr>
+              <w:spacing w:after="0" w:line="247" w:lineRule="auto"/>
+            </w:pPr>
+            <w:r>
+              <w:rPr>
+                <w:rFonts w:ascii="Aptos" w:hAnsi="Aptos"/>
+                <w:b/>
+                <w:color w:val="232B34"/>
+                <w:sz w:val="16"/>
+              </w:rPr>
+              <w:t>Laycan</w:t>
+            </w:r>
+          </w:p>
+        </w:tc>
+        <w:tc>
+          <w:tcPr>
+            <w:tcW w:w="6860" w:type="dxa"/>
+            <w:tcBorders>
+              <w:top w:val="single" w:sz="6" w:space="0" w:color="D2DAE5"/>
+              <w:left w:val="single" w:sz="6" w:space="0" w:color="D2DAE5"/>
+              <w:bottom w:val="single" w:sz="6" w:space="0" w:color="D2DAE5"/>
+              <w:right w:val="single" w:sz="6" w:space="0" w:color="D2DAE5"/>
+            </w:tcBorders>
+            <w:tcMar>
+              <w:top w:w="80" w:type="dxa"/>
+              <w:left w:w="110" w:type="dxa"/>
+              <w:bottom w:w="80" w:type="dxa"/>
+              <w:right w:w="110" w:type="dxa"/>
+            </w:tcMar>
+            <w:vAlign w:val="center"/>
+          </w:tcPr>
+          <w:p>
+            <w:pPr>
+              <w:spacing w:after="0" w:line="247" w:lineRule="auto"/>
+            </w:pPr>
+            <w:r>
+              <w:rPr>
+                <w:rFonts w:ascii="Aptos" w:hAnsi="Aptos"/>
+                <w:color w:val="232B34"/>
+                <w:sz w:val="16"/>
+              </w:rPr>
+              <w:t>The agreed vessel loading window or commitment period that creates downstream timing pressure for the logistics plan.</w:t>
+            </w:r>
+          </w:p>
+        </w:tc>
+      </w:tr>
+      <w:tr>
+        <w:trPr>
+          <w:cantSplit/>
+        </w:trPr>
+        <w:tc>
+          <w:tcPr>
+            <w:tcW w:w="2500" w:type="dxa"/>
+            <w:tcBorders>
+              <w:top w:val="single" w:sz="6" w:space="0" w:color="D2DAE5"/>
+              <w:left w:val="single" w:sz="6" w:space="0" w:color="D2DAE5"/>
+              <w:bottom w:val="single" w:sz="6" w:space="0" w:color="D2DAE5"/>
+              <w:right w:val="single" w:sz="6" w:space="0" w:color="D2DAE5"/>
+            </w:tcBorders>
+            <w:tcMar>
+              <w:top w:w="80" w:type="dxa"/>
+              <w:left w:w="110" w:type="dxa"/>
+              <w:bottom w:w="80" w:type="dxa"/>
+              <w:right w:w="110" w:type="dxa"/>
+            </w:tcMar>
+            <w:vAlign w:val="center"/>
+          </w:tcPr>
+          <w:p>
+            <w:pPr>
+              <w:spacing w:after="0" w:line="247" w:lineRule="auto"/>
+            </w:pPr>
+            <w:r>
+              <w:rPr>
+                <w:rFonts w:ascii="Aptos" w:hAnsi="Aptos"/>
+                <w:b/>
+                <w:color w:val="232B34"/>
+                <w:sz w:val="16"/>
+              </w:rPr>
+              <w:t>Cargo layer sequence</w:t>
+            </w:r>
+          </w:p>
+        </w:tc>
+        <w:tc>
+          <w:tcPr>
+            <w:tcW w:w="6860" w:type="dxa"/>
+            <w:tcBorders>
+              <w:top w:val="single" w:sz="6" w:space="0" w:color="D2DAE5"/>
+              <w:left w:val="single" w:sz="6" w:space="0" w:color="D2DAE5"/>
+              <w:bottom w:val="single" w:sz="6" w:space="0" w:color="D2DAE5"/>
+              <w:right w:val="single" w:sz="6" w:space="0" w:color="D2DAE5"/>
+            </w:tcBorders>
+            <w:tcMar>
+              <w:top w:w="80" w:type="dxa"/>
+              <w:left w:w="110" w:type="dxa"/>
+              <w:bottom w:w="80" w:type="dxa"/>
+              <w:right w:w="110" w:type="dxa"/>
+            </w:tcMar>
+            <w:vAlign w:val="center"/>
+          </w:tcPr>
+          <w:p>
+            <w:pPr>
+              <w:spacing w:after="0" w:line="247" w:lineRule="auto"/>
+            </w:pPr>
+            <w:r>
+              <w:rPr>
+                <w:rFonts w:ascii="Aptos" w:hAnsi="Aptos"/>
+                <w:color w:val="232B34"/>
+                <w:sz w:val="16"/>
+              </w:rPr>
+              <w:t>The required hatch, layer, grade or loading order that influences barge sequencing and OGV completion logic.</w:t>
+            </w:r>
+          </w:p>
+        </w:tc>
+      </w:tr>
+      <w:tr>
+        <w:trPr>
+          <w:cantSplit/>
+        </w:trPr>
+        <w:tc>
+          <w:tcPr>
+            <w:tcW w:w="2500" w:type="dxa"/>
+            <w:tcBorders>
+              <w:top w:val="single" w:sz="6" w:space="0" w:color="D2DAE5"/>
+              <w:left w:val="single" w:sz="6" w:space="0" w:color="D2DAE5"/>
+              <w:bottom w:val="single" w:sz="6" w:space="0" w:color="D2DAE5"/>
+              <w:right w:val="single" w:sz="6" w:space="0" w:color="D2DAE5"/>
+            </w:tcBorders>
+            <w:tcMar>
+              <w:top w:w="80" w:type="dxa"/>
+              <w:left w:w="110" w:type="dxa"/>
+              <w:bottom w:w="80" w:type="dxa"/>
+              <w:right w:w="110" w:type="dxa"/>
+            </w:tcMar>
+            <w:vAlign w:val="center"/>
+          </w:tcPr>
+          <w:p>
+            <w:pPr>
+              <w:spacing w:after="0" w:line="247" w:lineRule="auto"/>
+            </w:pPr>
+            <w:r>
+              <w:rPr>
+                <w:rFonts w:ascii="Aptos" w:hAnsi="Aptos"/>
+                <w:b/>
+                <w:color w:val="232B34"/>
+                <w:sz w:val="16"/>
+              </w:rPr>
+              <w:t>Operating window</w:t>
+            </w:r>
+          </w:p>
+        </w:tc>
+        <w:tc>
+          <w:tcPr>
+            <w:tcW w:w="6860" w:type="dxa"/>
+            <w:tcBorders>
+              <w:top w:val="single" w:sz="6" w:space="0" w:color="D2DAE5"/>
+              <w:left w:val="single" w:sz="6" w:space="0" w:color="D2DAE5"/>
+              <w:bottom w:val="single" w:sz="6" w:space="0" w:color="D2DAE5"/>
+              <w:right w:val="single" w:sz="6" w:space="0" w:color="D2DAE5"/>
+            </w:tcBorders>
+            <w:tcMar>
+              <w:top w:w="80" w:type="dxa"/>
+              <w:left w:w="110" w:type="dxa"/>
+              <w:bottom w:w="80" w:type="dxa"/>
+              <w:right w:w="110" w:type="dxa"/>
+            </w:tcMar>
+            <w:vAlign w:val="center"/>
+          </w:tcPr>
+          <w:p>
+            <w:pPr>
+              <w:spacing w:after="0" w:line="247" w:lineRule="auto"/>
+            </w:pPr>
+            <w:r>
+              <w:rPr>
+                <w:rFonts w:ascii="Aptos" w:hAnsi="Aptos"/>
+                <w:color w:val="232B34"/>
+                <w:sz w:val="16"/>
+              </w:rPr>
+              <w:t>A time period during which an operating step is feasible because required resource, capacity and rule conditions are available.</w:t>
+            </w:r>
+          </w:p>
+        </w:tc>
+      </w:tr>
+      <w:tr>
+        <w:trPr>
+          <w:cantSplit/>
+        </w:trPr>
+        <w:tc>
+          <w:tcPr>
+            <w:tcW w:w="2500" w:type="dxa"/>
+            <w:tcBorders>
+              <w:top w:val="single" w:sz="6" w:space="0" w:color="D2DAE5"/>
+              <w:left w:val="single" w:sz="6" w:space="0" w:color="D2DAE5"/>
+              <w:bottom w:val="single" w:sz="6" w:space="0" w:color="D2DAE5"/>
+              <w:right w:val="single" w:sz="6" w:space="0" w:color="D2DAE5"/>
+            </w:tcBorders>
+            <w:tcMar>
+              <w:top w:w="80" w:type="dxa"/>
+              <w:left w:w="110" w:type="dxa"/>
+              <w:bottom w:w="80" w:type="dxa"/>
+              <w:right w:w="110" w:type="dxa"/>
+            </w:tcMar>
+            <w:vAlign w:val="center"/>
+          </w:tcPr>
+          <w:p>
+            <w:pPr>
+              <w:spacing w:after="0" w:line="247" w:lineRule="auto"/>
+            </w:pPr>
+            <w:r>
+              <w:rPr>
+                <w:rFonts w:ascii="Aptos" w:hAnsi="Aptos"/>
+                <w:b/>
+                <w:color w:val="232B34"/>
+                <w:sz w:val="16"/>
+              </w:rPr>
+              <w:t>Tide window</w:t>
+            </w:r>
+          </w:p>
+        </w:tc>
+        <w:tc>
+          <w:tcPr>
+            <w:tcW w:w="6860" w:type="dxa"/>
+            <w:tcBorders>
+              <w:top w:val="single" w:sz="6" w:space="0" w:color="D2DAE5"/>
+              <w:left w:val="single" w:sz="6" w:space="0" w:color="D2DAE5"/>
+              <w:bottom w:val="single" w:sz="6" w:space="0" w:color="D2DAE5"/>
+              <w:right w:val="single" w:sz="6" w:space="0" w:color="D2DAE5"/>
+            </w:tcBorders>
+            <w:tcMar>
+              <w:top w:w="80" w:type="dxa"/>
+              <w:left w:w="110" w:type="dxa"/>
+              <w:bottom w:w="80" w:type="dxa"/>
+              <w:right w:w="110" w:type="dxa"/>
+            </w:tcMar>
+            <w:vAlign w:val="center"/>
+          </w:tcPr>
+          <w:p>
+            <w:pPr>
+              <w:spacing w:after="0" w:line="247" w:lineRule="auto"/>
+            </w:pPr>
+            <w:r>
+              <w:rPr>
+                <w:rFonts w:ascii="Aptos" w:hAnsi="Aptos"/>
+                <w:color w:val="232B34"/>
+                <w:sz w:val="16"/>
+              </w:rPr>
+              <w:t>A water-level or tidal period during which a vessel movement can safely or validly occur.</w:t>
+            </w:r>
+          </w:p>
+        </w:tc>
+      </w:tr>
+      <w:tr>
+        <w:trPr>
+          <w:cantSplit/>
+        </w:trPr>
+        <w:tc>
+          <w:tcPr>
+            <w:tcW w:w="2500" w:type="dxa"/>
+            <w:tcBorders>
+              <w:top w:val="single" w:sz="6" w:space="0" w:color="D2DAE5"/>
+              <w:left w:val="single" w:sz="6" w:space="0" w:color="D2DAE5"/>
+              <w:bottom w:val="single" w:sz="6" w:space="0" w:color="D2DAE5"/>
+              <w:right w:val="single" w:sz="6" w:space="0" w:color="D2DAE5"/>
+            </w:tcBorders>
+            <w:tcMar>
+              <w:top w:w="80" w:type="dxa"/>
+              <w:left w:w="110" w:type="dxa"/>
+              <w:bottom w:w="80" w:type="dxa"/>
+              <w:right w:w="110" w:type="dxa"/>
+            </w:tcMar>
+            <w:vAlign w:val="center"/>
+          </w:tcPr>
+          <w:p>
+            <w:pPr>
+              <w:spacing w:after="0" w:line="247" w:lineRule="auto"/>
+            </w:pPr>
+            <w:r>
+              <w:rPr>
+                <w:rFonts w:ascii="Aptos" w:hAnsi="Aptos"/>
+                <w:b/>
+                <w:color w:val="232B34"/>
+                <w:sz w:val="16"/>
+              </w:rPr>
+              <w:t>Bridge window</w:t>
+            </w:r>
+          </w:p>
+        </w:tc>
+        <w:tc>
+          <w:tcPr>
+            <w:tcW w:w="6860" w:type="dxa"/>
+            <w:tcBorders>
+              <w:top w:val="single" w:sz="6" w:space="0" w:color="D2DAE5"/>
+              <w:left w:val="single" w:sz="6" w:space="0" w:color="D2DAE5"/>
+              <w:bottom w:val="single" w:sz="6" w:space="0" w:color="D2DAE5"/>
+              <w:right w:val="single" w:sz="6" w:space="0" w:color="D2DAE5"/>
+            </w:tcBorders>
+            <w:tcMar>
+              <w:top w:w="80" w:type="dxa"/>
+              <w:left w:w="110" w:type="dxa"/>
+              <w:bottom w:w="80" w:type="dxa"/>
+              <w:right w:w="110" w:type="dxa"/>
+            </w:tcMar>
+            <w:vAlign w:val="center"/>
+          </w:tcPr>
+          <w:p>
+            <w:pPr>
+              <w:spacing w:after="0" w:line="247" w:lineRule="auto"/>
+            </w:pPr>
+            <w:r>
+              <w:rPr>
+                <w:rFonts w:ascii="Aptos" w:hAnsi="Aptos"/>
+                <w:color w:val="232B34"/>
+                <w:sz w:val="16"/>
+              </w:rPr>
+              <w:t>A permitted bridge crossing period or opening schedule that constrains route movement timing.</w:t>
+            </w:r>
+          </w:p>
+        </w:tc>
+      </w:tr>
+      <w:tr>
+        <w:trPr>
+          <w:cantSplit/>
+        </w:trPr>
+        <w:tc>
+          <w:tcPr>
+            <w:tcW w:w="2500" w:type="dxa"/>
+            <w:tcBorders>
+              <w:top w:val="single" w:sz="6" w:space="0" w:color="D2DAE5"/>
+              <w:left w:val="single" w:sz="6" w:space="0" w:color="D2DAE5"/>
+              <w:bottom w:val="single" w:sz="6" w:space="0" w:color="D2DAE5"/>
+              <w:right w:val="single" w:sz="6" w:space="0" w:color="D2DAE5"/>
+            </w:tcBorders>
+            <w:tcMar>
+              <w:top w:w="80" w:type="dxa"/>
+              <w:left w:w="110" w:type="dxa"/>
+              <w:bottom w:w="80" w:type="dxa"/>
+              <w:right w:w="110" w:type="dxa"/>
+            </w:tcMar>
+            <w:vAlign w:val="center"/>
+          </w:tcPr>
+          <w:p>
+            <w:pPr>
+              <w:spacing w:after="0" w:line="247" w:lineRule="auto"/>
+            </w:pPr>
+            <w:r>
+              <w:rPr>
+                <w:rFonts w:ascii="Aptos" w:hAnsi="Aptos"/>
+                <w:b/>
+                <w:color w:val="232B34"/>
+                <w:sz w:val="16"/>
+              </w:rPr>
+              <w:t>Route step</w:t>
+            </w:r>
+          </w:p>
+        </w:tc>
+        <w:tc>
+          <w:tcPr>
+            <w:tcW w:w="6860" w:type="dxa"/>
+            <w:tcBorders>
+              <w:top w:val="single" w:sz="6" w:space="0" w:color="D2DAE5"/>
+              <w:left w:val="single" w:sz="6" w:space="0" w:color="D2DAE5"/>
+              <w:bottom w:val="single" w:sz="6" w:space="0" w:color="D2DAE5"/>
+              <w:right w:val="single" w:sz="6" w:space="0" w:color="D2DAE5"/>
+            </w:tcBorders>
+            <w:tcMar>
+              <w:top w:w="80" w:type="dxa"/>
+              <w:left w:w="110" w:type="dxa"/>
+              <w:bottom w:w="80" w:type="dxa"/>
+              <w:right w:w="110" w:type="dxa"/>
+            </w:tcMar>
+            <w:vAlign w:val="center"/>
+          </w:tcPr>
+          <w:p>
+            <w:pPr>
+              <w:spacing w:after="0" w:line="247" w:lineRule="auto"/>
+            </w:pPr>
+            <w:r>
+              <w:rPr>
+                <w:rFonts w:ascii="Aptos" w:hAnsi="Aptos"/>
+                <w:color w:val="232B34"/>
+                <w:sz w:val="16"/>
+              </w:rPr>
+              <w:t>A defined operational step in the movement chain, such as loading, departure, tide passage, bridge crossing, CTS discharge or OGV completion.</w:t>
+            </w:r>
+          </w:p>
+        </w:tc>
+      </w:tr>
+      <w:tr>
+        <w:trPr>
+          <w:cantSplit/>
+        </w:trPr>
+        <w:tc>
+          <w:tcPr>
+            <w:tcW w:w="2500" w:type="dxa"/>
+            <w:tcBorders>
+              <w:top w:val="single" w:sz="6" w:space="0" w:color="D2DAE5"/>
+              <w:left w:val="single" w:sz="6" w:space="0" w:color="D2DAE5"/>
+              <w:bottom w:val="single" w:sz="6" w:space="0" w:color="D2DAE5"/>
+              <w:right w:val="single" w:sz="6" w:space="0" w:color="D2DAE5"/>
+            </w:tcBorders>
+            <w:tcMar>
+              <w:top w:w="80" w:type="dxa"/>
+              <w:left w:w="110" w:type="dxa"/>
+              <w:bottom w:w="80" w:type="dxa"/>
+              <w:right w:w="110" w:type="dxa"/>
+            </w:tcMar>
+            <w:vAlign w:val="center"/>
+          </w:tcPr>
+          <w:p>
+            <w:pPr>
+              <w:spacing w:after="0" w:line="247" w:lineRule="auto"/>
+            </w:pPr>
+            <w:r>
+              <w:rPr>
+                <w:rFonts w:ascii="Aptos" w:hAnsi="Aptos"/>
+                <w:b/>
+                <w:color w:val="232B34"/>
+                <w:sz w:val="16"/>
+              </w:rPr>
+              <w:t>Scheduling entity</w:t>
+            </w:r>
+          </w:p>
+        </w:tc>
+        <w:tc>
+          <w:tcPr>
+            <w:tcW w:w="6860" w:type="dxa"/>
+            <w:tcBorders>
+              <w:top w:val="single" w:sz="6" w:space="0" w:color="D2DAE5"/>
+              <w:left w:val="single" w:sz="6" w:space="0" w:color="D2DAE5"/>
+              <w:bottom w:val="single" w:sz="6" w:space="0" w:color="D2DAE5"/>
+              <w:right w:val="single" w:sz="6" w:space="0" w:color="D2DAE5"/>
+            </w:tcBorders>
+            <w:tcMar>
+              <w:top w:w="80" w:type="dxa"/>
+              <w:left w:w="110" w:type="dxa"/>
+              <w:bottom w:w="80" w:type="dxa"/>
+              <w:right w:w="110" w:type="dxa"/>
+            </w:tcMar>
+            <w:vAlign w:val="center"/>
+          </w:tcPr>
+          <w:p>
+            <w:pPr>
+              <w:spacing w:after="0" w:line="247" w:lineRule="auto"/>
+            </w:pPr>
+            <w:r>
+              <w:rPr>
+                <w:rFonts w:ascii="Aptos" w:hAnsi="Aptos"/>
+                <w:color w:val="232B34"/>
+                <w:sz w:val="16"/>
+              </w:rPr>
+              <w:t>A shipment movement or trip represented as schedulable work with dependencies, resources, priorities and target dates.</w:t>
+            </w:r>
+          </w:p>
+        </w:tc>
+      </w:tr>
+      <w:tr>
+        <w:trPr>
+          <w:cantSplit/>
+        </w:trPr>
+        <w:tc>
+          <w:tcPr>
+            <w:tcW w:w="2500" w:type="dxa"/>
+            <w:tcBorders>
+              <w:top w:val="single" w:sz="6" w:space="0" w:color="D2DAE5"/>
+              <w:left w:val="single" w:sz="6" w:space="0" w:color="D2DAE5"/>
+              <w:bottom w:val="single" w:sz="6" w:space="0" w:color="D2DAE5"/>
+              <w:right w:val="single" w:sz="6" w:space="0" w:color="D2DAE5"/>
+            </w:tcBorders>
+            <w:tcMar>
+              <w:top w:w="80" w:type="dxa"/>
+              <w:left w:w="110" w:type="dxa"/>
+              <w:bottom w:w="80" w:type="dxa"/>
+              <w:right w:w="110" w:type="dxa"/>
+            </w:tcMar>
+            <w:vAlign w:val="center"/>
+          </w:tcPr>
+          <w:p>
+            <w:pPr>
+              <w:spacing w:after="0" w:line="247" w:lineRule="auto"/>
+            </w:pPr>
+            <w:r>
+              <w:rPr>
+                <w:rFonts w:ascii="Aptos" w:hAnsi="Aptos"/>
+                <w:b/>
+                <w:color w:val="232B34"/>
+                <w:sz w:val="16"/>
+              </w:rPr>
+              <w:t>Capacity-window placement</w:t>
+            </w:r>
+          </w:p>
+        </w:tc>
+        <w:tc>
+          <w:tcPr>
+            <w:tcW w:w="6860" w:type="dxa"/>
+            <w:tcBorders>
+              <w:top w:val="single" w:sz="6" w:space="0" w:color="D2DAE5"/>
+              <w:left w:val="single" w:sz="6" w:space="0" w:color="D2DAE5"/>
+              <w:bottom w:val="single" w:sz="6" w:space="0" w:color="D2DAE5"/>
+              <w:right w:val="single" w:sz="6" w:space="0" w:color="D2DAE5"/>
+            </w:tcBorders>
+            <w:tcMar>
+              <w:top w:w="80" w:type="dxa"/>
+              <w:left w:w="110" w:type="dxa"/>
+              <w:bottom w:w="80" w:type="dxa"/>
+              <w:right w:w="110" w:type="dxa"/>
+            </w:tcMar>
+            <w:vAlign w:val="center"/>
+          </w:tcPr>
+          <w:p>
+            <w:pPr>
+              <w:spacing w:after="0" w:line="247" w:lineRule="auto"/>
+            </w:pPr>
+            <w:r>
+              <w:rPr>
+                <w:rFonts w:ascii="Aptos" w:hAnsi="Aptos"/>
+                <w:color w:val="232B34"/>
+                <w:sz w:val="16"/>
+              </w:rPr>
+              <w:t>The scheduling logic that places movements into available operating windows while preventing invalid overlap or infeasible sequencing.</w:t>
+            </w:r>
+          </w:p>
+        </w:tc>
+      </w:tr>
+      <w:tr>
+        <w:trPr>
+          <w:cantSplit/>
+        </w:trPr>
+        <w:tc>
+          <w:tcPr>
+            <w:tcW w:w="2500" w:type="dxa"/>
+            <w:tcBorders>
+              <w:top w:val="single" w:sz="6" w:space="0" w:color="D2DAE5"/>
+              <w:left w:val="single" w:sz="6" w:space="0" w:color="D2DAE5"/>
+              <w:bottom w:val="single" w:sz="6" w:space="0" w:color="D2DAE5"/>
+              <w:right w:val="single" w:sz="6" w:space="0" w:color="D2DAE5"/>
+            </w:tcBorders>
+            <w:tcMar>
+              <w:top w:w="80" w:type="dxa"/>
+              <w:left w:w="110" w:type="dxa"/>
+              <w:bottom w:w="80" w:type="dxa"/>
+              <w:right w:w="110" w:type="dxa"/>
+            </w:tcMar>
+            <w:vAlign w:val="center"/>
+          </w:tcPr>
+          <w:p>
+            <w:pPr>
+              <w:spacing w:after="0" w:line="247" w:lineRule="auto"/>
+            </w:pPr>
+            <w:r>
+              <w:rPr>
+                <w:rFonts w:ascii="Aptos" w:hAnsi="Aptos"/>
+                <w:b/>
+                <w:color w:val="232B34"/>
+                <w:sz w:val="16"/>
+              </w:rPr>
+              <w:t>Dynamic constraint</w:t>
+            </w:r>
+          </w:p>
+        </w:tc>
+        <w:tc>
+          <w:tcPr>
+            <w:tcW w:w="6860" w:type="dxa"/>
+            <w:tcBorders>
+              <w:top w:val="single" w:sz="6" w:space="0" w:color="D2DAE5"/>
+              <w:left w:val="single" w:sz="6" w:space="0" w:color="D2DAE5"/>
+              <w:bottom w:val="single" w:sz="6" w:space="0" w:color="D2DAE5"/>
+              <w:right w:val="single" w:sz="6" w:space="0" w:color="D2DAE5"/>
+            </w:tcBorders>
+            <w:tcMar>
+              <w:top w:w="80" w:type="dxa"/>
+              <w:left w:w="110" w:type="dxa"/>
+              <w:bottom w:w="80" w:type="dxa"/>
+              <w:right w:w="110" w:type="dxa"/>
+            </w:tcMar>
+            <w:vAlign w:val="center"/>
+          </w:tcPr>
+          <w:p>
+            <w:pPr>
+              <w:spacing w:after="0" w:line="247" w:lineRule="auto"/>
+            </w:pPr>
+            <w:r>
+              <w:rPr>
+                <w:rFonts w:ascii="Aptos" w:hAnsi="Aptos"/>
+                <w:color w:val="232B34"/>
+                <w:sz w:val="16"/>
+              </w:rPr>
+              <w:t>A constraint whose feasibility changes during execution, such as tide, bridge access, cargo readiness, asset availability, berth or CTS status.</w:t>
+            </w:r>
+          </w:p>
+        </w:tc>
+      </w:tr>
+      <w:tr>
+        <w:trPr>
+          <w:cantSplit/>
+        </w:trPr>
+        <w:tc>
+          <w:tcPr>
+            <w:tcW w:w="2500" w:type="dxa"/>
+            <w:tcBorders>
+              <w:top w:val="single" w:sz="6" w:space="0" w:color="D2DAE5"/>
+              <w:left w:val="single" w:sz="6" w:space="0" w:color="D2DAE5"/>
+              <w:bottom w:val="single" w:sz="6" w:space="0" w:color="D2DAE5"/>
+              <w:right w:val="single" w:sz="6" w:space="0" w:color="D2DAE5"/>
+            </w:tcBorders>
+            <w:tcMar>
+              <w:top w:w="80" w:type="dxa"/>
+              <w:left w:w="110" w:type="dxa"/>
+              <w:bottom w:w="80" w:type="dxa"/>
+              <w:right w:w="110" w:type="dxa"/>
+            </w:tcMar>
+            <w:vAlign w:val="center"/>
+          </w:tcPr>
+          <w:p>
+            <w:pPr>
+              <w:spacing w:after="0" w:line="247" w:lineRule="auto"/>
+            </w:pPr>
+            <w:r>
+              <w:rPr>
+                <w:rFonts w:ascii="Aptos" w:hAnsi="Aptos"/>
+                <w:b/>
+                <w:color w:val="232B34"/>
+                <w:sz w:val="16"/>
+              </w:rPr>
+              <w:t>Feasible plan</w:t>
+            </w:r>
+          </w:p>
+        </w:tc>
+        <w:tc>
+          <w:tcPr>
+            <w:tcW w:w="6860" w:type="dxa"/>
+            <w:tcBorders>
+              <w:top w:val="single" w:sz="6" w:space="0" w:color="D2DAE5"/>
+              <w:left w:val="single" w:sz="6" w:space="0" w:color="D2DAE5"/>
+              <w:bottom w:val="single" w:sz="6" w:space="0" w:color="D2DAE5"/>
+              <w:right w:val="single" w:sz="6" w:space="0" w:color="D2DAE5"/>
+            </w:tcBorders>
+            <w:tcMar>
+              <w:top w:w="80" w:type="dxa"/>
+              <w:left w:w="110" w:type="dxa"/>
+              <w:bottom w:w="80" w:type="dxa"/>
+              <w:right w:w="110" w:type="dxa"/>
+            </w:tcMar>
+            <w:vAlign w:val="center"/>
+          </w:tcPr>
+          <w:p>
+            <w:pPr>
+              <w:spacing w:after="0" w:line="247" w:lineRule="auto"/>
+            </w:pPr>
+            <w:r>
+              <w:rPr>
+                <w:rFonts w:ascii="Aptos" w:hAnsi="Aptos"/>
+                <w:color w:val="232B34"/>
+                <w:sz w:val="16"/>
+              </w:rPr>
+              <w:t>A draft or approved plan where movement steps are placed through eligible resources and valid operating windows without unresolved blockers.</w:t>
+            </w:r>
+          </w:p>
+        </w:tc>
+      </w:tr>
+      <w:tr>
+        <w:trPr>
+          <w:cantSplit/>
+        </w:trPr>
+        <w:tc>
+          <w:tcPr>
+            <w:tcW w:w="2500" w:type="dxa"/>
+            <w:tcBorders>
+              <w:top w:val="single" w:sz="6" w:space="0" w:color="D2DAE5"/>
+              <w:left w:val="single" w:sz="6" w:space="0" w:color="D2DAE5"/>
+              <w:bottom w:val="single" w:sz="6" w:space="0" w:color="D2DAE5"/>
+              <w:right w:val="single" w:sz="6" w:space="0" w:color="D2DAE5"/>
+            </w:tcBorders>
+            <w:tcMar>
+              <w:top w:w="80" w:type="dxa"/>
+              <w:left w:w="110" w:type="dxa"/>
+              <w:bottom w:w="80" w:type="dxa"/>
+              <w:right w:w="110" w:type="dxa"/>
+            </w:tcMar>
+            <w:vAlign w:val="center"/>
+          </w:tcPr>
+          <w:p>
+            <w:pPr>
+              <w:spacing w:after="0" w:line="247" w:lineRule="auto"/>
+            </w:pPr>
+            <w:r>
+              <w:rPr>
+                <w:rFonts w:ascii="Aptos" w:hAnsi="Aptos"/>
+                <w:b/>
+                <w:color w:val="232B34"/>
+                <w:sz w:val="16"/>
+              </w:rPr>
+              <w:lastRenderedPageBreak/>
+              <w:t>Conflict / blocker</w:t>
+            </w:r>
+          </w:p>
+        </w:tc>
+        <w:tc>
+          <w:tcPr>
+            <w:tcW w:w="6860" w:type="dxa"/>
+            <w:tcBorders>
+              <w:top w:val="single" w:sz="6" w:space="0" w:color="D2DAE5"/>
+              <w:left w:val="single" w:sz="6" w:space="0" w:color="D2DAE5"/>
+              <w:bottom w:val="single" w:sz="6" w:space="0" w:color="D2DAE5"/>
+              <w:right w:val="single" w:sz="6" w:space="0" w:color="D2DAE5"/>
+            </w:tcBorders>
+            <w:tcMar>
+              <w:top w:w="80" w:type="dxa"/>
+              <w:left w:w="110" w:type="dxa"/>
+              <w:bottom w:w="80" w:type="dxa"/>
+              <w:right w:w="110" w:type="dxa"/>
+            </w:tcMar>
+            <w:vAlign w:val="center"/>
+          </w:tcPr>
+          <w:p>
+            <w:pPr>
+              <w:spacing w:after="0" w:line="247" w:lineRule="auto"/>
+            </w:pPr>
+            <w:r>
+              <w:rPr>
+                <w:rFonts w:ascii="Aptos" w:hAnsi="Aptos"/>
+                <w:color w:val="232B34"/>
+                <w:sz w:val="16"/>
+              </w:rPr>
+              <w:t>A surfaced reason why a movement cannot be scheduled or published, such as missing capacity, invalid route, unavailable asset or closed operating window.</w:t>
+            </w:r>
+          </w:p>
+        </w:tc>
+      </w:tr>
+      <w:tr>
+        <w:trPr>
+          <w:cantSplit/>
+        </w:trPr>
+        <w:tc>
+          <w:tcPr>
+            <w:tcW w:w="2500" w:type="dxa"/>
+            <w:tcBorders>
+              <w:top w:val="single" w:sz="6" w:space="0" w:color="D2DAE5"/>
+              <w:left w:val="single" w:sz="6" w:space="0" w:color="D2DAE5"/>
+              <w:bottom w:val="single" w:sz="6" w:space="0" w:color="D2DAE5"/>
+              <w:right w:val="single" w:sz="6" w:space="0" w:color="D2DAE5"/>
+            </w:tcBorders>
+            <w:tcMar>
+              <w:top w:w="80" w:type="dxa"/>
+              <w:left w:w="110" w:type="dxa"/>
+              <w:bottom w:w="80" w:type="dxa"/>
+              <w:right w:w="110" w:type="dxa"/>
+            </w:tcMar>
+            <w:vAlign w:val="center"/>
+          </w:tcPr>
+          <w:p>
+            <w:pPr>
+              <w:spacing w:after="0" w:line="247" w:lineRule="auto"/>
+            </w:pPr>
+            <w:r>
+              <w:rPr>
+                <w:rFonts w:ascii="Aptos" w:hAnsi="Aptos"/>
+                <w:b/>
+                <w:color w:val="232B34"/>
+                <w:sz w:val="16"/>
+              </w:rPr>
+              <w:t>Plan version</w:t>
+            </w:r>
+          </w:p>
+        </w:tc>
+        <w:tc>
+          <w:tcPr>
+            <w:tcW w:w="6860" w:type="dxa"/>
+            <w:tcBorders>
+              <w:top w:val="single" w:sz="6" w:space="0" w:color="D2DAE5"/>
+              <w:left w:val="single" w:sz="6" w:space="0" w:color="D2DAE5"/>
+              <w:bottom w:val="single" w:sz="6" w:space="0" w:color="D2DAE5"/>
+              <w:right w:val="single" w:sz="6" w:space="0" w:color="D2DAE5"/>
+            </w:tcBorders>
+            <w:tcMar>
+              <w:top w:w="80" w:type="dxa"/>
+              <w:left w:w="110" w:type="dxa"/>
+              <w:bottom w:w="80" w:type="dxa"/>
+              <w:right w:w="110" w:type="dxa"/>
+            </w:tcMar>
+            <w:vAlign w:val="center"/>
+          </w:tcPr>
+          <w:p>
+            <w:pPr>
+              <w:spacing w:after="0" w:line="247" w:lineRule="auto"/>
+            </w:pPr>
+            <w:r>
+              <w:rPr>
+                <w:rFonts w:ascii="Aptos" w:hAnsi="Aptos"/>
+                <w:color w:val="232B34"/>
+                <w:sz w:val="16"/>
+              </w:rPr>
+              <w:t>A controlled planning snapshot created when a draft, replanned or recovery plan changes from an earlier version.</w:t>
+            </w:r>
+          </w:p>
+        </w:tc>
+      </w:tr>
+      <w:tr>
+        <w:trPr>
+          <w:cantSplit/>
+        </w:trPr>
+        <w:tc>
+          <w:tcPr>
+            <w:tcW w:w="2500" w:type="dxa"/>
+            <w:tcBorders>
+              <w:top w:val="single" w:sz="6" w:space="0" w:color="D2DAE5"/>
+              <w:left w:val="single" w:sz="6" w:space="0" w:color="D2DAE5"/>
+              <w:bottom w:val="single" w:sz="6" w:space="0" w:color="D2DAE5"/>
+              <w:right w:val="single" w:sz="6" w:space="0" w:color="D2DAE5"/>
+            </w:tcBorders>
+            <w:tcMar>
+              <w:top w:w="80" w:type="dxa"/>
+              <w:left w:w="110" w:type="dxa"/>
+              <w:bottom w:w="80" w:type="dxa"/>
+              <w:right w:w="110" w:type="dxa"/>
+            </w:tcMar>
+            <w:vAlign w:val="center"/>
+          </w:tcPr>
+          <w:p>
+            <w:pPr>
+              <w:spacing w:after="0" w:line="247" w:lineRule="auto"/>
+            </w:pPr>
+            <w:r>
+              <w:rPr>
+                <w:rFonts w:ascii="Aptos" w:hAnsi="Aptos"/>
+                <w:b/>
+                <w:color w:val="232B34"/>
+                <w:sz w:val="16"/>
+              </w:rPr>
+              <w:t>Published plan</w:t>
+            </w:r>
+          </w:p>
+        </w:tc>
+        <w:tc>
+          <w:tcPr>
+            <w:tcW w:w="6860" w:type="dxa"/>
+            <w:tcBorders>
+              <w:top w:val="single" w:sz="6" w:space="0" w:color="D2DAE5"/>
+              <w:left w:val="single" w:sz="6" w:space="0" w:color="D2DAE5"/>
+              <w:bottom w:val="single" w:sz="6" w:space="0" w:color="D2DAE5"/>
+              <w:right w:val="single" w:sz="6" w:space="0" w:color="D2DAE5"/>
+            </w:tcBorders>
+            <w:tcMar>
+              <w:top w:w="80" w:type="dxa"/>
+              <w:left w:w="110" w:type="dxa"/>
+              <w:bottom w:w="80" w:type="dxa"/>
+              <w:right w:w="110" w:type="dxa"/>
+            </w:tcMar>
+            <w:vAlign w:val="center"/>
+          </w:tcPr>
+          <w:p>
+            <w:pPr>
+              <w:spacing w:after="0" w:line="247" w:lineRule="auto"/>
+            </w:pPr>
+            <w:r>
+              <w:rPr>
+                <w:rFonts w:ascii="Aptos" w:hAnsi="Aptos"/>
+                <w:color w:val="232B34"/>
+                <w:sz w:val="16"/>
+              </w:rPr>
+              <w:t>The approved execution contract released for operational use; later changes create successor versions rather than editing the published snapshot.</w:t>
+            </w:r>
+          </w:p>
+        </w:tc>
+      </w:tr>
+      <w:tr>
+        <w:trPr>
+          <w:cantSplit/>
+        </w:trPr>
+        <w:tc>
+          <w:tcPr>
+            <w:tcW w:w="2500" w:type="dxa"/>
+            <w:tcBorders>
+              <w:top w:val="single" w:sz="6" w:space="0" w:color="D2DAE5"/>
+              <w:left w:val="single" w:sz="6" w:space="0" w:color="D2DAE5"/>
+              <w:bottom w:val="single" w:sz="6" w:space="0" w:color="D2DAE5"/>
+              <w:right w:val="single" w:sz="6" w:space="0" w:color="D2DAE5"/>
+            </w:tcBorders>
+            <w:tcMar>
+              <w:top w:w="80" w:type="dxa"/>
+              <w:left w:w="110" w:type="dxa"/>
+              <w:bottom w:w="80" w:type="dxa"/>
+              <w:right w:w="110" w:type="dxa"/>
+            </w:tcMar>
+            <w:vAlign w:val="center"/>
+          </w:tcPr>
+          <w:p>
+            <w:pPr>
+              <w:spacing w:after="0" w:line="247" w:lineRule="auto"/>
+            </w:pPr>
+            <w:r>
+              <w:rPr>
+                <w:rFonts w:ascii="Aptos" w:hAnsi="Aptos"/>
+                <w:b/>
+                <w:color w:val="232B34"/>
+                <w:sz w:val="16"/>
+              </w:rPr>
+              <w:t>Publishability check</w:t>
+            </w:r>
+          </w:p>
+        </w:tc>
+        <w:tc>
+          <w:tcPr>
+            <w:tcW w:w="6860" w:type="dxa"/>
+            <w:tcBorders>
+              <w:top w:val="single" w:sz="6" w:space="0" w:color="D2DAE5"/>
+              <w:left w:val="single" w:sz="6" w:space="0" w:color="D2DAE5"/>
+              <w:bottom w:val="single" w:sz="6" w:space="0" w:color="D2DAE5"/>
+              <w:right w:val="single" w:sz="6" w:space="0" w:color="D2DAE5"/>
+            </w:tcBorders>
+            <w:tcMar>
+              <w:top w:w="80" w:type="dxa"/>
+              <w:left w:w="110" w:type="dxa"/>
+              <w:bottom w:w="80" w:type="dxa"/>
+              <w:right w:w="110" w:type="dxa"/>
+            </w:tcMar>
+            <w:vAlign w:val="center"/>
+          </w:tcPr>
+          <w:p>
+            <w:pPr>
+              <w:spacing w:after="0" w:line="247" w:lineRule="auto"/>
+            </w:pPr>
+            <w:r>
+              <w:rPr>
+                <w:rFonts w:ascii="Aptos" w:hAnsi="Aptos"/>
+                <w:color w:val="232B34"/>
+                <w:sz w:val="16"/>
+              </w:rPr>
+              <w:t>The rule-based validation that verifies whether a plan is complete, approved and free of blocking exceptions before manual publication.</w:t>
+            </w:r>
+          </w:p>
+        </w:tc>
+      </w:tr>
+      <w:tr>
+        <w:trPr>
+          <w:cantSplit/>
+        </w:trPr>
+        <w:tc>
+          <w:tcPr>
+            <w:tcW w:w="2500" w:type="dxa"/>
+            <w:tcBorders>
+              <w:top w:val="single" w:sz="6" w:space="0" w:color="D2DAE5"/>
+              <w:left w:val="single" w:sz="6" w:space="0" w:color="D2DAE5"/>
+              <w:bottom w:val="single" w:sz="6" w:space="0" w:color="D2DAE5"/>
+              <w:right w:val="single" w:sz="6" w:space="0" w:color="D2DAE5"/>
+            </w:tcBorders>
+            <w:tcMar>
+              <w:top w:w="80" w:type="dxa"/>
+              <w:left w:w="110" w:type="dxa"/>
+              <w:bottom w:w="80" w:type="dxa"/>
+              <w:right w:w="110" w:type="dxa"/>
+            </w:tcMar>
+            <w:vAlign w:val="center"/>
+          </w:tcPr>
+          <w:p>
+            <w:pPr>
+              <w:spacing w:after="0" w:line="247" w:lineRule="auto"/>
+            </w:pPr>
+            <w:r>
+              <w:rPr>
+                <w:rFonts w:ascii="Aptos" w:hAnsi="Aptos"/>
+                <w:b/>
+                <w:color w:val="232B34"/>
+                <w:sz w:val="16"/>
+              </w:rPr>
+              <w:t>Scenario</w:t>
+            </w:r>
+          </w:p>
+        </w:tc>
+        <w:tc>
+          <w:tcPr>
+            <w:tcW w:w="6860" w:type="dxa"/>
+            <w:tcBorders>
+              <w:top w:val="single" w:sz="6" w:space="0" w:color="D2DAE5"/>
+              <w:left w:val="single" w:sz="6" w:space="0" w:color="D2DAE5"/>
+              <w:bottom w:val="single" w:sz="6" w:space="0" w:color="D2DAE5"/>
+              <w:right w:val="single" w:sz="6" w:space="0" w:color="D2DAE5"/>
+            </w:tcBorders>
+            <w:tcMar>
+              <w:top w:w="80" w:type="dxa"/>
+              <w:left w:w="110" w:type="dxa"/>
+              <w:bottom w:w="80" w:type="dxa"/>
+              <w:right w:w="110" w:type="dxa"/>
+            </w:tcMar>
+            <w:vAlign w:val="center"/>
+          </w:tcPr>
+          <w:p>
+            <w:pPr>
+              <w:spacing w:after="0" w:line="247" w:lineRule="auto"/>
+            </w:pPr>
+            <w:r>
+              <w:rPr>
+                <w:rFonts w:ascii="Aptos" w:hAnsi="Aptos"/>
+                <w:color w:val="232B34"/>
+                <w:sz w:val="16"/>
+              </w:rPr>
+              <w:t>A what-if planning case used to test delay, outage, window change, reassignment or recovery assumptions without mutating the published plan.</w:t>
+            </w:r>
+          </w:p>
+        </w:tc>
+      </w:tr>
+      <w:tr>
+        <w:trPr>
+          <w:cantSplit/>
+        </w:trPr>
+        <w:tc>
+          <w:tcPr>
+            <w:tcW w:w="2500" w:type="dxa"/>
+            <w:tcBorders>
+              <w:top w:val="single" w:sz="6" w:space="0" w:color="D2DAE5"/>
+              <w:left w:val="single" w:sz="6" w:space="0" w:color="D2DAE5"/>
+              <w:bottom w:val="single" w:sz="6" w:space="0" w:color="D2DAE5"/>
+              <w:right w:val="single" w:sz="6" w:space="0" w:color="D2DAE5"/>
+            </w:tcBorders>
+            <w:tcMar>
+              <w:top w:w="80" w:type="dxa"/>
+              <w:left w:w="110" w:type="dxa"/>
+              <w:bottom w:w="80" w:type="dxa"/>
+              <w:right w:w="110" w:type="dxa"/>
+            </w:tcMar>
+            <w:vAlign w:val="center"/>
+          </w:tcPr>
+          <w:p>
+            <w:pPr>
+              <w:spacing w:after="0" w:line="247" w:lineRule="auto"/>
+            </w:pPr>
+            <w:r>
+              <w:rPr>
+                <w:rFonts w:ascii="Aptos" w:hAnsi="Aptos"/>
+                <w:b/>
+                <w:color w:val="232B34"/>
+                <w:sz w:val="16"/>
+              </w:rPr>
+              <w:t>Recovery option</w:t>
+            </w:r>
+          </w:p>
+        </w:tc>
+        <w:tc>
+          <w:tcPr>
+            <w:tcW w:w="6860" w:type="dxa"/>
+            <w:tcBorders>
+              <w:top w:val="single" w:sz="6" w:space="0" w:color="D2DAE5"/>
+              <w:left w:val="single" w:sz="6" w:space="0" w:color="D2DAE5"/>
+              <w:bottom w:val="single" w:sz="6" w:space="0" w:color="D2DAE5"/>
+              <w:right w:val="single" w:sz="6" w:space="0" w:color="D2DAE5"/>
+            </w:tcBorders>
+            <w:tcMar>
+              <w:top w:w="80" w:type="dxa"/>
+              <w:left w:w="110" w:type="dxa"/>
+              <w:bottom w:w="80" w:type="dxa"/>
+              <w:right w:w="110" w:type="dxa"/>
+            </w:tcMar>
+            <w:vAlign w:val="center"/>
+          </w:tcPr>
+          <w:p>
+            <w:pPr>
+              <w:spacing w:after="0" w:line="247" w:lineRule="auto"/>
+            </w:pPr>
+            <w:r>
+              <w:rPr>
+                <w:rFonts w:ascii="Aptos" w:hAnsi="Aptos"/>
+                <w:color w:val="232B34"/>
+                <w:sz w:val="16"/>
+              </w:rPr>
+              <w:t>A ranked candidate response to disruption, evaluated for feasibility, downstream impact and approval readiness.</w:t>
+            </w:r>
+          </w:p>
+        </w:tc>
+      </w:tr>
+      <w:tr>
+        <w:trPr>
+          <w:cantSplit/>
+        </w:trPr>
+        <w:tc>
+          <w:tcPr>
+            <w:tcW w:w="2500" w:type="dxa"/>
+            <w:tcBorders>
+              <w:top w:val="single" w:sz="6" w:space="0" w:color="D2DAE5"/>
+              <w:left w:val="single" w:sz="6" w:space="0" w:color="D2DAE5"/>
+              <w:bottom w:val="single" w:sz="6" w:space="0" w:color="D2DAE5"/>
+              <w:right w:val="single" w:sz="6" w:space="0" w:color="D2DAE5"/>
+            </w:tcBorders>
+            <w:tcMar>
+              <w:top w:w="80" w:type="dxa"/>
+              <w:left w:w="110" w:type="dxa"/>
+              <w:bottom w:w="80" w:type="dxa"/>
+              <w:right w:w="110" w:type="dxa"/>
+            </w:tcMar>
+            <w:vAlign w:val="center"/>
+          </w:tcPr>
+          <w:p>
+            <w:pPr>
+              <w:spacing w:after="0" w:line="247" w:lineRule="auto"/>
+            </w:pPr>
+            <w:r>
+              <w:rPr>
+                <w:rFonts w:ascii="Aptos" w:hAnsi="Aptos"/>
+                <w:b/>
+                <w:color w:val="232B34"/>
+                <w:sz w:val="16"/>
+              </w:rPr>
+              <w:t>Live evidence</w:t>
+            </w:r>
+          </w:p>
+        </w:tc>
+        <w:tc>
+          <w:tcPr>
+            <w:tcW w:w="6860" w:type="dxa"/>
+            <w:tcBorders>
+              <w:top w:val="single" w:sz="6" w:space="0" w:color="D2DAE5"/>
+              <w:left w:val="single" w:sz="6" w:space="0" w:color="D2DAE5"/>
+              <w:bottom w:val="single" w:sz="6" w:space="0" w:color="D2DAE5"/>
+              <w:right w:val="single" w:sz="6" w:space="0" w:color="D2DAE5"/>
+            </w:tcBorders>
+            <w:tcMar>
+              <w:top w:w="80" w:type="dxa"/>
+              <w:left w:w="110" w:type="dxa"/>
+              <w:bottom w:w="80" w:type="dxa"/>
+              <w:right w:w="110" w:type="dxa"/>
+            </w:tcMar>
+            <w:vAlign w:val="center"/>
+          </w:tcPr>
+          <w:p>
+            <w:pPr>
+              <w:spacing w:after="0" w:line="247" w:lineRule="auto"/>
+            </w:pPr>
+            <w:r>
+              <w:rPr>
+                <w:rFonts w:ascii="Aptos" w:hAnsi="Aptos"/>
+                <w:color w:val="232B34"/>
+                <w:sz w:val="16"/>
+              </w:rPr>
+              <w:t>Observed data such as GPS/AIS-style positions, signals, alerts or feed updates used to inform operations but not automatically change plan authority.</w:t>
+            </w:r>
+          </w:p>
+        </w:tc>
+      </w:tr>
+      <w:tr>
+        <w:trPr>
+          <w:cantSplit/>
+        </w:trPr>
+        <w:tc>
+          <w:tcPr>
+            <w:tcW w:w="2500" w:type="dxa"/>
+            <w:tcBorders>
+              <w:top w:val="single" w:sz="6" w:space="0" w:color="D2DAE5"/>
+              <w:left w:val="single" w:sz="6" w:space="0" w:color="D2DAE5"/>
+              <w:bottom w:val="single" w:sz="6" w:space="0" w:color="D2DAE5"/>
+              <w:right w:val="single" w:sz="6" w:space="0" w:color="D2DAE5"/>
+            </w:tcBorders>
+            <w:tcMar>
+              <w:top w:w="80" w:type="dxa"/>
+              <w:left w:w="110" w:type="dxa"/>
+              <w:bottom w:w="80" w:type="dxa"/>
+              <w:right w:w="110" w:type="dxa"/>
+            </w:tcMar>
+            <w:vAlign w:val="center"/>
+          </w:tcPr>
+          <w:p>
+            <w:pPr>
+              <w:spacing w:after="0" w:line="247" w:lineRule="auto"/>
+            </w:pPr>
+            <w:r>
+              <w:rPr>
+                <w:rFonts w:ascii="Aptos" w:hAnsi="Aptos"/>
+                <w:b/>
+                <w:color w:val="232B34"/>
+                <w:sz w:val="16"/>
+              </w:rPr>
+              <w:t>GPS/AIS evidence</w:t>
+            </w:r>
+          </w:p>
+        </w:tc>
+        <w:tc>
+          <w:tcPr>
+            <w:tcW w:w="6860" w:type="dxa"/>
+            <w:tcBorders>
+              <w:top w:val="single" w:sz="6" w:space="0" w:color="D2DAE5"/>
+              <w:left w:val="single" w:sz="6" w:space="0" w:color="D2DAE5"/>
+              <w:bottom w:val="single" w:sz="6" w:space="0" w:color="D2DAE5"/>
+              <w:right w:val="single" w:sz="6" w:space="0" w:color="D2DAE5"/>
+            </w:tcBorders>
+            <w:tcMar>
+              <w:top w:w="80" w:type="dxa"/>
+              <w:left w:w="110" w:type="dxa"/>
+              <w:bottom w:w="80" w:type="dxa"/>
+              <w:right w:w="110" w:type="dxa"/>
+            </w:tcMar>
+            <w:vAlign w:val="center"/>
+          </w:tcPr>
+          <w:p>
+            <w:pPr>
+              <w:spacing w:after="0" w:line="247" w:lineRule="auto"/>
+            </w:pPr>
+            <w:r>
+              <w:rPr>
+                <w:rFonts w:ascii="Aptos" w:hAnsi="Aptos"/>
+                <w:color w:val="232B34"/>
+                <w:sz w:val="16"/>
+              </w:rPr>
+              <w:t>Position and movement evidence from tracking or vessel-location sources; it is treated as evidence until confirmed through operational rules.</w:t>
+            </w:r>
+          </w:p>
+        </w:tc>
+      </w:tr>
+      <w:tr>
+        <w:trPr>
+          <w:cantSplit/>
+        </w:trPr>
+        <w:tc>
+          <w:tcPr>
+            <w:tcW w:w="2500" w:type="dxa"/>
+            <w:tcBorders>
+              <w:top w:val="single" w:sz="6" w:space="0" w:color="D2DAE5"/>
+              <w:left w:val="single" w:sz="6" w:space="0" w:color="D2DAE5"/>
+              <w:bottom w:val="single" w:sz="6" w:space="0" w:color="D2DAE5"/>
+              <w:right w:val="single" w:sz="6" w:space="0" w:color="D2DAE5"/>
+            </w:tcBorders>
+            <w:tcMar>
+              <w:top w:w="80" w:type="dxa"/>
+              <w:left w:w="110" w:type="dxa"/>
+              <w:bottom w:w="80" w:type="dxa"/>
+              <w:right w:w="110" w:type="dxa"/>
+            </w:tcMar>
+            <w:vAlign w:val="center"/>
+          </w:tcPr>
+          <w:p>
+            <w:pPr>
+              <w:spacing w:after="0" w:line="247" w:lineRule="auto"/>
+            </w:pPr>
+            <w:r>
+              <w:rPr>
+                <w:rFonts w:ascii="Aptos" w:hAnsi="Aptos"/>
+                <w:b/>
+                <w:color w:val="232B34"/>
+                <w:sz w:val="16"/>
+              </w:rPr>
+              <w:t>Geofence</w:t>
+            </w:r>
+          </w:p>
+        </w:tc>
+        <w:tc>
+          <w:tcPr>
+            <w:tcW w:w="6860" w:type="dxa"/>
+            <w:tcBorders>
+              <w:top w:val="single" w:sz="6" w:space="0" w:color="D2DAE5"/>
+              <w:left w:val="single" w:sz="6" w:space="0" w:color="D2DAE5"/>
+              <w:bottom w:val="single" w:sz="6" w:space="0" w:color="D2DAE5"/>
+              <w:right w:val="single" w:sz="6" w:space="0" w:color="D2DAE5"/>
+            </w:tcBorders>
+            <w:tcMar>
+              <w:top w:w="80" w:type="dxa"/>
+              <w:left w:w="110" w:type="dxa"/>
+              <w:bottom w:w="80" w:type="dxa"/>
+              <w:right w:w="110" w:type="dxa"/>
+            </w:tcMar>
+            <w:vAlign w:val="center"/>
+          </w:tcPr>
+          <w:p>
+            <w:pPr>
+              <w:spacing w:after="0" w:line="247" w:lineRule="auto"/>
+            </w:pPr>
+            <w:r>
+              <w:rPr>
+                <w:rFonts w:ascii="Aptos" w:hAnsi="Aptos"/>
+                <w:color w:val="232B34"/>
+                <w:sz w:val="16"/>
+              </w:rPr>
+              <w:t>A configured operating zone used to detect whether an asset has entered, exited or remained within a relevant location boundary.</w:t>
+            </w:r>
+          </w:p>
+        </w:tc>
+      </w:tr>
+      <w:tr>
+        <w:trPr>
+          <w:cantSplit/>
+        </w:trPr>
+        <w:tc>
+          <w:tcPr>
+            <w:tcW w:w="2500" w:type="dxa"/>
+            <w:tcBorders>
+              <w:top w:val="single" w:sz="6" w:space="0" w:color="D2DAE5"/>
+              <w:left w:val="single" w:sz="6" w:space="0" w:color="D2DAE5"/>
+              <w:bottom w:val="single" w:sz="6" w:space="0" w:color="D2DAE5"/>
+              <w:right w:val="single" w:sz="6" w:space="0" w:color="D2DAE5"/>
+            </w:tcBorders>
+            <w:tcMar>
+              <w:top w:w="80" w:type="dxa"/>
+              <w:left w:w="110" w:type="dxa"/>
+              <w:bottom w:w="80" w:type="dxa"/>
+              <w:right w:w="110" w:type="dxa"/>
+            </w:tcMar>
+            <w:vAlign w:val="center"/>
+          </w:tcPr>
+          <w:p>
+            <w:pPr>
+              <w:spacing w:after="0" w:line="247" w:lineRule="auto"/>
+            </w:pPr>
+            <w:r>
+              <w:rPr>
+                <w:rFonts w:ascii="Aptos" w:hAnsi="Aptos"/>
+                <w:b/>
+                <w:color w:val="232B34"/>
+                <w:sz w:val="16"/>
+              </w:rPr>
+              <w:t>ETA variance</w:t>
+            </w:r>
+          </w:p>
+        </w:tc>
+        <w:tc>
+          <w:tcPr>
+            <w:tcW w:w="6860" w:type="dxa"/>
+            <w:tcBorders>
+              <w:top w:val="single" w:sz="6" w:space="0" w:color="D2DAE5"/>
+              <w:left w:val="single" w:sz="6" w:space="0" w:color="D2DAE5"/>
+              <w:bottom w:val="single" w:sz="6" w:space="0" w:color="D2DAE5"/>
+              <w:right w:val="single" w:sz="6" w:space="0" w:color="D2DAE5"/>
+            </w:tcBorders>
+            <w:tcMar>
+              <w:top w:w="80" w:type="dxa"/>
+              <w:left w:w="110" w:type="dxa"/>
+              <w:bottom w:w="80" w:type="dxa"/>
+              <w:right w:w="110" w:type="dxa"/>
+            </w:tcMar>
+            <w:vAlign w:val="center"/>
+          </w:tcPr>
+          <w:p>
+            <w:pPr>
+              <w:spacing w:after="0" w:line="247" w:lineRule="auto"/>
+            </w:pPr>
+            <w:r>
+              <w:rPr>
+                <w:rFonts w:ascii="Aptos" w:hAnsi="Aptos"/>
+                <w:color w:val="232B34"/>
+                <w:sz w:val="16"/>
+              </w:rPr>
+              <w:t>The difference between expected and observed/projected arrival timing, used to raise alerts or trigger scenario review.</w:t>
+            </w:r>
+          </w:p>
+        </w:tc>
+      </w:tr>
+      <w:tr>
+        <w:trPr>
+          <w:cantSplit/>
+        </w:trPr>
+        <w:tc>
+          <w:tcPr>
+            <w:tcW w:w="2500" w:type="dxa"/>
+            <w:tcBorders>
+              <w:top w:val="single" w:sz="6" w:space="0" w:color="D2DAE5"/>
+              <w:left w:val="single" w:sz="6" w:space="0" w:color="D2DAE5"/>
+              <w:bottom w:val="single" w:sz="6" w:space="0" w:color="D2DAE5"/>
+              <w:right w:val="single" w:sz="6" w:space="0" w:color="D2DAE5"/>
+            </w:tcBorders>
+            <w:tcMar>
+              <w:top w:w="80" w:type="dxa"/>
+              <w:left w:w="110" w:type="dxa"/>
+              <w:bottom w:w="80" w:type="dxa"/>
+              <w:right w:w="110" w:type="dxa"/>
+            </w:tcMar>
+            <w:vAlign w:val="center"/>
+          </w:tcPr>
+          <w:p>
+            <w:pPr>
+              <w:spacing w:after="0" w:line="247" w:lineRule="auto"/>
+            </w:pPr>
+            <w:r>
+              <w:rPr>
+                <w:rFonts w:ascii="Aptos" w:hAnsi="Aptos"/>
+                <w:b/>
+                <w:color w:val="232B34"/>
+                <w:sz w:val="16"/>
+              </w:rPr>
+              <w:t>Event candidate</w:t>
+            </w:r>
+          </w:p>
+        </w:tc>
+        <w:tc>
+          <w:tcPr>
+            <w:tcW w:w="6860" w:type="dxa"/>
+            <w:tcBorders>
+              <w:top w:val="single" w:sz="6" w:space="0" w:color="D2DAE5"/>
+              <w:left w:val="single" w:sz="6" w:space="0" w:color="D2DAE5"/>
+              <w:bottom w:val="single" w:sz="6" w:space="0" w:color="D2DAE5"/>
+              <w:right w:val="single" w:sz="6" w:space="0" w:color="D2DAE5"/>
+            </w:tcBorders>
+            <w:tcMar>
+              <w:top w:w="80" w:type="dxa"/>
+              <w:left w:w="110" w:type="dxa"/>
+              <w:bottom w:w="80" w:type="dxa"/>
+              <w:right w:w="110" w:type="dxa"/>
+            </w:tcMar>
+            <w:vAlign w:val="center"/>
+          </w:tcPr>
+          <w:p>
+            <w:pPr>
+              <w:spacing w:after="0" w:line="247" w:lineRule="auto"/>
+            </w:pPr>
+            <w:r>
+              <w:rPr>
+                <w:rFonts w:ascii="Aptos" w:hAnsi="Aptos"/>
+                <w:color w:val="232B34"/>
+                <w:sz w:val="16"/>
+              </w:rPr>
+              <w:t>A proposed operational event from device, feed or operator input that requires trust, dedupe and confirmation before becoming actual execution state.</w:t>
+            </w:r>
+          </w:p>
+        </w:tc>
+      </w:tr>
+      <w:tr>
+        <w:trPr>
+          <w:cantSplit/>
+        </w:trPr>
+        <w:tc>
+          <w:tcPr>
+            <w:tcW w:w="2500" w:type="dxa"/>
+            <w:tcBorders>
+              <w:top w:val="single" w:sz="6" w:space="0" w:color="D2DAE5"/>
+              <w:left w:val="single" w:sz="6" w:space="0" w:color="D2DAE5"/>
+              <w:bottom w:val="single" w:sz="6" w:space="0" w:color="D2DAE5"/>
+              <w:right w:val="single" w:sz="6" w:space="0" w:color="D2DAE5"/>
+            </w:tcBorders>
+            <w:tcMar>
+              <w:top w:w="80" w:type="dxa"/>
+              <w:left w:w="110" w:type="dxa"/>
+              <w:bottom w:w="80" w:type="dxa"/>
+              <w:right w:w="110" w:type="dxa"/>
+            </w:tcMar>
+            <w:vAlign w:val="center"/>
+          </w:tcPr>
+          <w:p>
+            <w:pPr>
+              <w:spacing w:after="0" w:line="247" w:lineRule="auto"/>
+            </w:pPr>
+            <w:r>
+              <w:rPr>
+                <w:rFonts w:ascii="Aptos" w:hAnsi="Aptos"/>
+                <w:b/>
+                <w:color w:val="232B34"/>
+                <w:sz w:val="16"/>
+              </w:rPr>
+              <w:t>Confirmed event</w:t>
+            </w:r>
+          </w:p>
+        </w:tc>
+        <w:tc>
+          <w:tcPr>
+            <w:tcW w:w="6860" w:type="dxa"/>
+            <w:tcBorders>
+              <w:top w:val="single" w:sz="6" w:space="0" w:color="D2DAE5"/>
+              <w:left w:val="single" w:sz="6" w:space="0" w:color="D2DAE5"/>
+              <w:bottom w:val="single" w:sz="6" w:space="0" w:color="D2DAE5"/>
+              <w:right w:val="single" w:sz="6" w:space="0" w:color="D2DAE5"/>
+            </w:tcBorders>
+            <w:tcMar>
+              <w:top w:w="80" w:type="dxa"/>
+              <w:left w:w="110" w:type="dxa"/>
+              <w:bottom w:w="80" w:type="dxa"/>
+              <w:right w:w="110" w:type="dxa"/>
+            </w:tcMar>
+            <w:vAlign w:val="center"/>
+          </w:tcPr>
+          <w:p>
+            <w:pPr>
+              <w:spacing w:after="0" w:line="247" w:lineRule="auto"/>
+            </w:pPr>
+            <w:r>
+              <w:rPr>
+                <w:rFonts w:ascii="Aptos" w:hAnsi="Aptos"/>
+                <w:color w:val="232B34"/>
+                <w:sz w:val="16"/>
+              </w:rPr>
+              <w:t>An accepted operational milestone, such as loading completion, bridge crossing or CTS discharge, that updates actual execution status.</w:t>
+            </w:r>
+          </w:p>
+        </w:tc>
+      </w:tr>
+      <w:tr>
+        <w:trPr>
+          <w:cantSplit/>
+        </w:trPr>
+        <w:tc>
+          <w:tcPr>
+            <w:tcW w:w="2500" w:type="dxa"/>
+            <w:tcBorders>
+              <w:top w:val="single" w:sz="6" w:space="0" w:color="D2DAE5"/>
+              <w:left w:val="single" w:sz="6" w:space="0" w:color="D2DAE5"/>
+              <w:bottom w:val="single" w:sz="6" w:space="0" w:color="D2DAE5"/>
+              <w:right w:val="single" w:sz="6" w:space="0" w:color="D2DAE5"/>
+            </w:tcBorders>
+            <w:tcMar>
+              <w:top w:w="80" w:type="dxa"/>
+              <w:left w:w="110" w:type="dxa"/>
+              <w:bottom w:w="80" w:type="dxa"/>
+              <w:right w:w="110" w:type="dxa"/>
+            </w:tcMar>
+            <w:vAlign w:val="center"/>
+          </w:tcPr>
+          <w:p>
+            <w:pPr>
+              <w:spacing w:after="0" w:line="247" w:lineRule="auto"/>
+            </w:pPr>
+            <w:r>
+              <w:rPr>
+                <w:rFonts w:ascii="Aptos" w:hAnsi="Aptos"/>
+                <w:b/>
+                <w:color w:val="232B34"/>
+                <w:sz w:val="16"/>
+              </w:rPr>
+              <w:t>Actualization</w:t>
+            </w:r>
+          </w:p>
+        </w:tc>
+        <w:tc>
+          <w:tcPr>
+            <w:tcW w:w="6860" w:type="dxa"/>
+            <w:tcBorders>
+              <w:top w:val="single" w:sz="6" w:space="0" w:color="D2DAE5"/>
+              <w:left w:val="single" w:sz="6" w:space="0" w:color="D2DAE5"/>
+              <w:bottom w:val="single" w:sz="6" w:space="0" w:color="D2DAE5"/>
+              <w:right w:val="single" w:sz="6" w:space="0" w:color="D2DAE5"/>
+            </w:tcBorders>
+            <w:tcMar>
+              <w:top w:w="80" w:type="dxa"/>
+              <w:left w:w="110" w:type="dxa"/>
+              <w:bottom w:w="80" w:type="dxa"/>
+              <w:right w:w="110" w:type="dxa"/>
+            </w:tcMar>
+            <w:vAlign w:val="center"/>
+          </w:tcPr>
+          <w:p>
+            <w:pPr>
+              <w:spacing w:after="0" w:line="247" w:lineRule="auto"/>
+            </w:pPr>
+            <w:r>
+              <w:rPr>
+                <w:rFonts w:ascii="Aptos" w:hAnsi="Aptos"/>
+                <w:color w:val="232B34"/>
+                <w:sz w:val="16"/>
+              </w:rPr>
+              <w:t>The controlled update of the execution record after an event is confirmed, preserving separation between planned, observed and actual states.</w:t>
+            </w:r>
+          </w:p>
+        </w:tc>
+      </w:tr>
+      <w:tr>
+        <w:trPr>
+          <w:cantSplit/>
+        </w:trPr>
+        <w:tc>
+          <w:tcPr>
+            <w:tcW w:w="2500" w:type="dxa"/>
+            <w:tcBorders>
+              <w:top w:val="single" w:sz="6" w:space="0" w:color="D2DAE5"/>
+              <w:left w:val="single" w:sz="6" w:space="0" w:color="D2DAE5"/>
+              <w:bottom w:val="single" w:sz="6" w:space="0" w:color="D2DAE5"/>
+              <w:right w:val="single" w:sz="6" w:space="0" w:color="D2DAE5"/>
+            </w:tcBorders>
+            <w:tcMar>
+              <w:top w:w="80" w:type="dxa"/>
+              <w:left w:w="110" w:type="dxa"/>
+              <w:bottom w:w="80" w:type="dxa"/>
+              <w:right w:w="110" w:type="dxa"/>
+            </w:tcMar>
+            <w:vAlign w:val="center"/>
+          </w:tcPr>
+          <w:p>
+            <w:pPr>
+              <w:spacing w:after="0" w:line="247" w:lineRule="auto"/>
+            </w:pPr>
+            <w:r>
+              <w:rPr>
+                <w:rFonts w:ascii="Aptos" w:hAnsi="Aptos"/>
+                <w:b/>
+                <w:color w:val="232B34"/>
+                <w:sz w:val="16"/>
+              </w:rPr>
+              <w:t>Immutable snapshot</w:t>
+            </w:r>
+          </w:p>
+        </w:tc>
+        <w:tc>
+          <w:tcPr>
+            <w:tcW w:w="6860" w:type="dxa"/>
+            <w:tcBorders>
+              <w:top w:val="single" w:sz="6" w:space="0" w:color="D2DAE5"/>
+              <w:left w:val="single" w:sz="6" w:space="0" w:color="D2DAE5"/>
+              <w:bottom w:val="single" w:sz="6" w:space="0" w:color="D2DAE5"/>
+              <w:right w:val="single" w:sz="6" w:space="0" w:color="D2DAE5"/>
+            </w:tcBorders>
+            <w:tcMar>
+              <w:top w:w="80" w:type="dxa"/>
+              <w:left w:w="110" w:type="dxa"/>
+              <w:bottom w:w="80" w:type="dxa"/>
+              <w:right w:w="110" w:type="dxa"/>
+            </w:tcMar>
+            <w:vAlign w:val="center"/>
+          </w:tcPr>
+          <w:p>
+            <w:pPr>
+              <w:spacing w:after="0" w:line="247" w:lineRule="auto"/>
+            </w:pPr>
+            <w:r>
+              <w:rPr>
+                <w:rFonts w:ascii="Aptos" w:hAnsi="Aptos"/>
+                <w:color w:val="232B34"/>
+                <w:sz w:val="16"/>
+              </w:rPr>
+              <w:t>A preserved record of an approved or published plan state that is not overwritten by later replanning.</w:t>
+            </w:r>
+          </w:p>
+        </w:tc>
+      </w:tr>
+      <w:tr>
+        <w:trPr>
+          <w:cantSplit/>
+        </w:trPr>
+        <w:tc>
+          <w:tcPr>
+            <w:tcW w:w="2500" w:type="dxa"/>
+            <w:tcBorders>
+              <w:top w:val="single" w:sz="6" w:space="0" w:color="D2DAE5"/>
+              <w:left w:val="single" w:sz="6" w:space="0" w:color="D2DAE5"/>
+              <w:bottom w:val="single" w:sz="6" w:space="0" w:color="D2DAE5"/>
+              <w:right w:val="single" w:sz="6" w:space="0" w:color="D2DAE5"/>
+            </w:tcBorders>
+            <w:tcMar>
+              <w:top w:w="80" w:type="dxa"/>
+              <w:left w:w="110" w:type="dxa"/>
+              <w:bottom w:w="80" w:type="dxa"/>
+              <w:right w:w="110" w:type="dxa"/>
+            </w:tcMar>
+            <w:vAlign w:val="center"/>
+          </w:tcPr>
+          <w:p>
+            <w:pPr>
+              <w:spacing w:after="0" w:line="247" w:lineRule="auto"/>
+            </w:pPr>
+            <w:r>
+              <w:rPr>
+                <w:rFonts w:ascii="Aptos" w:hAnsi="Aptos"/>
+                <w:b/>
+                <w:color w:val="232B34"/>
+                <w:sz w:val="16"/>
+              </w:rPr>
+              <w:t>Dual approval</w:t>
+            </w:r>
+          </w:p>
+        </w:tc>
+        <w:tc>
+          <w:tcPr>
+            <w:tcW w:w="6860" w:type="dxa"/>
+            <w:tcBorders>
+              <w:top w:val="single" w:sz="6" w:space="0" w:color="D2DAE5"/>
+              <w:left w:val="single" w:sz="6" w:space="0" w:color="D2DAE5"/>
+              <w:bottom w:val="single" w:sz="6" w:space="0" w:color="D2DAE5"/>
+              <w:right w:val="single" w:sz="6" w:space="0" w:color="D2DAE5"/>
+            </w:tcBorders>
+            <w:tcMar>
+              <w:top w:w="80" w:type="dxa"/>
+              <w:left w:w="110" w:type="dxa"/>
+              <w:bottom w:w="80" w:type="dxa"/>
+              <w:right w:w="110" w:type="dxa"/>
+            </w:tcMar>
+            <w:vAlign w:val="center"/>
+          </w:tcPr>
+          <w:p>
+            <w:pPr>
+              <w:spacing w:after="0" w:line="247" w:lineRule="auto"/>
+            </w:pPr>
+            <w:r>
+              <w:rPr>
+                <w:rFonts w:ascii="Aptos" w:hAnsi="Aptos"/>
+                <w:color w:val="232B34"/>
+                <w:sz w:val="16"/>
+              </w:rPr>
+              <w:t>The governed approval model where required Berau and ABL authorities validate the plan before publication.</w:t>
+            </w:r>
+          </w:p>
+        </w:tc>
+      </w:tr>
+      <w:tr>
+        <w:trPr>
+          <w:cantSplit/>
+        </w:trPr>
+        <w:tc>
+          <w:tcPr>
+            <w:tcW w:w="2500" w:type="dxa"/>
+            <w:tcBorders>
+              <w:top w:val="single" w:sz="6" w:space="0" w:color="D2DAE5"/>
+              <w:left w:val="single" w:sz="6" w:space="0" w:color="D2DAE5"/>
+              <w:bottom w:val="single" w:sz="6" w:space="0" w:color="D2DAE5"/>
+              <w:right w:val="single" w:sz="6" w:space="0" w:color="D2DAE5"/>
+            </w:tcBorders>
+            <w:tcMar>
+              <w:top w:w="80" w:type="dxa"/>
+              <w:left w:w="110" w:type="dxa"/>
+              <w:bottom w:w="80" w:type="dxa"/>
+              <w:right w:w="110" w:type="dxa"/>
+            </w:tcMar>
+            <w:vAlign w:val="center"/>
+          </w:tcPr>
+          <w:p>
+            <w:pPr>
+              <w:spacing w:after="0" w:line="247" w:lineRule="auto"/>
+            </w:pPr>
+            <w:r>
+              <w:rPr>
+                <w:rFonts w:ascii="Aptos" w:hAnsi="Aptos"/>
+                <w:b/>
+                <w:color w:val="232B34"/>
+                <w:sz w:val="16"/>
+              </w:rPr>
+              <w:t>Governed export</w:t>
+            </w:r>
+          </w:p>
+        </w:tc>
+        <w:tc>
+          <w:tcPr>
+            <w:tcW w:w="6860" w:type="dxa"/>
+            <w:tcBorders>
+              <w:top w:val="single" w:sz="6" w:space="0" w:color="D2DAE5"/>
+              <w:left w:val="single" w:sz="6" w:space="0" w:color="D2DAE5"/>
+              <w:bottom w:val="single" w:sz="6" w:space="0" w:color="D2DAE5"/>
+              <w:right w:val="single" w:sz="6" w:space="0" w:color="D2DAE5"/>
+            </w:tcBorders>
+            <w:tcMar>
+              <w:top w:w="80" w:type="dxa"/>
+              <w:left w:w="110" w:type="dxa"/>
+              <w:bottom w:w="80" w:type="dxa"/>
+              <w:right w:w="110" w:type="dxa"/>
+            </w:tcMar>
+            <w:vAlign w:val="center"/>
+          </w:tcPr>
+          <w:p>
+            <w:pPr>
+              <w:spacing w:after="0" w:line="247" w:lineRule="auto"/>
+            </w:pPr>
+            <w:r>
+              <w:rPr>
+                <w:rFonts w:ascii="Aptos" w:hAnsi="Aptos"/>
+                <w:color w:val="232B34"/>
+                <w:sz w:val="16"/>
+              </w:rPr>
+              <w:t>An audit-backed output of the approved or published plan for controlled communication and operational reference.</w:t>
+            </w:r>
+          </w:p>
+        </w:tc>
+      </w:tr>
+      <w:tr>
+        <w:trPr>
+          <w:cantSplit/>
+        </w:trPr>
+        <w:tc>
+          <w:tcPr>
+            <w:tcW w:w="2500" w:type="dxa"/>
+            <w:tcBorders>
+              <w:top w:val="single" w:sz="6" w:space="0" w:color="D2DAE5"/>
+              <w:left w:val="single" w:sz="6" w:space="0" w:color="D2DAE5"/>
+              <w:bottom w:val="single" w:sz="6" w:space="0" w:color="D2DAE5"/>
+              <w:right w:val="single" w:sz="6" w:space="0" w:color="D2DAE5"/>
+            </w:tcBorders>
+            <w:tcMar>
+              <w:top w:w="80" w:type="dxa"/>
+              <w:left w:w="110" w:type="dxa"/>
+              <w:bottom w:w="80" w:type="dxa"/>
+              <w:right w:w="110" w:type="dxa"/>
+            </w:tcMar>
+            <w:vAlign w:val="center"/>
+          </w:tcPr>
+          <w:p>
+            <w:pPr>
+              <w:spacing w:after="0" w:line="247" w:lineRule="auto"/>
+            </w:pPr>
+            <w:r>
+              <w:rPr>
+                <w:rFonts w:ascii="Aptos" w:hAnsi="Aptos"/>
+                <w:b/>
+                <w:color w:val="232B34"/>
+                <w:sz w:val="16"/>
+              </w:rPr>
+              <w:t>Vector proprietary scaffolding</w:t>
+            </w:r>
+          </w:p>
+        </w:tc>
+        <w:tc>
+          <w:tcPr>
+            <w:tcW w:w="6860" w:type="dxa"/>
+            <w:tcBorders>
+              <w:top w:val="single" w:sz="6" w:space="0" w:color="D2DAE5"/>
+              <w:left w:val="single" w:sz="6" w:space="0" w:color="D2DAE5"/>
+              <w:bottom w:val="single" w:sz="6" w:space="0" w:color="D2DAE5"/>
+              <w:right w:val="single" w:sz="6" w:space="0" w:color="D2DAE5"/>
+            </w:tcBorders>
+            <w:tcMar>
+              <w:top w:w="80" w:type="dxa"/>
+              <w:left w:w="110" w:type="dxa"/>
+              <w:bottom w:w="80" w:type="dxa"/>
+              <w:right w:w="110" w:type="dxa"/>
+            </w:tcMar>
+            <w:vAlign w:val="center"/>
+          </w:tcPr>
+          <w:p>
+            <w:pPr>
+              <w:spacing w:after="0" w:line="247" w:lineRule="auto"/>
+            </w:pPr>
+            <w:r>
+              <w:rPr>
+                <w:rFonts w:ascii="Aptos" w:hAnsi="Aptos"/>
+                <w:color w:val="232B34"/>
+                <w:sz w:val="16"/>
+              </w:rPr>
+              <w:t>Vector-owned base capability for scheduling, scenario simulation and dynamic-constraint evaluation, adapted for the ABL operating context.</w:t>
+            </w:r>
+          </w:p>
+        </w:tc>
+      </w:tr>
+      <w:tr>
+        <w:trPr>
+          <w:cantSplit/>
+        </w:trPr>
+        <w:tc>
+          <w:tcPr>
+            <w:tcW w:w="2500" w:type="dxa"/>
+            <w:tcBorders>
+              <w:top w:val="single" w:sz="6" w:space="0" w:color="D2DAE5"/>
+              <w:left w:val="single" w:sz="6" w:space="0" w:color="D2DAE5"/>
+              <w:bottom w:val="single" w:sz="6" w:space="0" w:color="D2DAE5"/>
+              <w:right w:val="single" w:sz="6" w:space="0" w:color="D2DAE5"/>
+            </w:tcBorders>
+            <w:tcMar>
+              <w:top w:w="80" w:type="dxa"/>
+              <w:left w:w="110" w:type="dxa"/>
+              <w:bottom w:w="80" w:type="dxa"/>
+              <w:right w:w="110" w:type="dxa"/>
+            </w:tcMar>
+            <w:vAlign w:val="center"/>
+          </w:tcPr>
+          <w:p>
+            <w:pPr>
+              <w:spacing w:after="0" w:line="247" w:lineRule="auto"/>
+            </w:pPr>
+            <w:r>
+              <w:rPr>
+                <w:rFonts w:ascii="Aptos" w:hAnsi="Aptos"/>
+                <w:b/>
+                <w:color w:val="232B34"/>
+                <w:sz w:val="16"/>
+              </w:rPr>
+              <w:t>Control tower</w:t>
+            </w:r>
+          </w:p>
+        </w:tc>
+        <w:tc>
+          <w:tcPr>
+            <w:tcW w:w="6860" w:type="dxa"/>
+            <w:tcBorders>
+              <w:top w:val="single" w:sz="6" w:space="0" w:color="D2DAE5"/>
+              <w:left w:val="single" w:sz="6" w:space="0" w:color="D2DAE5"/>
+              <w:bottom w:val="single" w:sz="6" w:space="0" w:color="D2DAE5"/>
+              <w:right w:val="single" w:sz="6" w:space="0" w:color="D2DAE5"/>
+            </w:tcBorders>
+            <w:tcMar>
+              <w:top w:w="80" w:type="dxa"/>
+              <w:left w:w="110" w:type="dxa"/>
+              <w:bottom w:w="80" w:type="dxa"/>
+              <w:right w:w="110" w:type="dxa"/>
+            </w:tcMar>
+            <w:vAlign w:val="center"/>
+          </w:tcPr>
+          <w:p>
+            <w:pPr>
+              <w:spacing w:after="0" w:line="247" w:lineRule="auto"/>
+            </w:pPr>
+            <w:r>
+              <w:rPr>
+                <w:rFonts w:ascii="Aptos" w:hAnsi="Aptos"/>
+                <w:color w:val="232B34"/>
+                <w:sz w:val="16"/>
+              </w:rPr>
+              <w:t>The mature product state where planning, execution evidence, exception recovery, approvals and management review operate from a shared governed cockpit.</w:t>
+            </w:r>
+          </w:p>
+        </w:tc>
+      </w:tr>
+      <w:tr>
+        <w:trPr>
+          <w:cantSplit/>
+        </w:trPr>
+        <w:tc>
+          <w:tcPr>
+            <w:tcW w:w="2500" w:type="dxa"/>
+            <w:tcBorders>
+              <w:top w:val="single" w:sz="6" w:space="0" w:color="D2DAE5"/>
+              <w:left w:val="single" w:sz="6" w:space="0" w:color="D2DAE5"/>
+              <w:bottom w:val="single" w:sz="6" w:space="0" w:color="D2DAE5"/>
+              <w:right w:val="single" w:sz="6" w:space="0" w:color="D2DAE5"/>
+            </w:tcBorders>
+            <w:tcMar>
+              <w:top w:w="80" w:type="dxa"/>
+              <w:left w:w="110" w:type="dxa"/>
+              <w:bottom w:w="80" w:type="dxa"/>
+              <w:right w:w="110" w:type="dxa"/>
+            </w:tcMar>
+            <w:vAlign w:val="center"/>
+          </w:tcPr>
+          <w:p>
+            <w:pPr>
+              <w:spacing w:after="0" w:line="247" w:lineRule="auto"/>
+            </w:pPr>
+            <w:r>
+              <w:rPr>
+                <w:rFonts w:ascii="Aptos" w:hAnsi="Aptos"/>
+                <w:b/>
+                <w:color w:val="232B34"/>
+                <w:sz w:val="16"/>
+              </w:rPr>
+              <w:t>MQTT</w:t>
+            </w:r>
+          </w:p>
+        </w:tc>
+        <w:tc>
+          <w:tcPr>
+            <w:tcW w:w="6860" w:type="dxa"/>
+            <w:tcBorders>
+              <w:top w:val="single" w:sz="6" w:space="0" w:color="D2DAE5"/>
+              <w:left w:val="single" w:sz="6" w:space="0" w:color="D2DAE5"/>
+              <w:bottom w:val="single" w:sz="6" w:space="0" w:color="D2DAE5"/>
+              <w:right w:val="single" w:sz="6" w:space="0" w:color="D2DAE5"/>
+            </w:tcBorders>
+            <w:tcMar>
+              <w:top w:w="80" w:type="dxa"/>
+              <w:left w:w="110" w:type="dxa"/>
+              <w:bottom w:w="80" w:type="dxa"/>
+              <w:right w:w="110" w:type="dxa"/>
+            </w:tcMar>
+            <w:vAlign w:val="center"/>
+          </w:tcPr>
+          <w:p>
+            <w:pPr>
+              <w:spacing w:after="0" w:line="247" w:lineRule="auto"/>
+            </w:pPr>
+            <w:r>
+              <w:rPr>
+                <w:rFonts w:ascii="Aptos" w:hAnsi="Aptos"/>
+                <w:color w:val="232B34"/>
+                <w:sz w:val="16"/>
+              </w:rPr>
+              <w:t>A lightweight publish/subscribe messaging protocol that may be used for device, gateway or field-event updates where confirmed integration scope requires near-real-time messaging.</w:t>
+            </w:r>
+          </w:p>
+        </w:tc>
+      </w:tr>
+      <w:tr>
+        <w:trPr>
+          <w:cantSplit/>
+        </w:trPr>
+        <w:tc>
+          <w:tcPr>
+            <w:tcW w:w="2500" w:type="dxa"/>
+            <w:tcBorders>
+              <w:top w:val="single" w:sz="6" w:space="0" w:color="D2DAE5"/>
+              <w:left w:val="single" w:sz="6" w:space="0" w:color="D2DAE5"/>
+              <w:bottom w:val="single" w:sz="6" w:space="0" w:color="D2DAE5"/>
+              <w:right w:val="single" w:sz="6" w:space="0" w:color="D2DAE5"/>
+            </w:tcBorders>
+            <w:tcMar>
+              <w:top w:w="80" w:type="dxa"/>
+              <w:left w:w="110" w:type="dxa"/>
+              <w:bottom w:w="80" w:type="dxa"/>
+              <w:right w:w="110" w:type="dxa"/>
+            </w:tcMar>
+            <w:vAlign w:val="center"/>
+          </w:tcPr>
+          <w:p>
+            <w:pPr>
+              <w:spacing w:after="0" w:line="247" w:lineRule="auto"/>
+            </w:pPr>
+            <w:r>
+              <w:rPr>
+                <w:rFonts w:ascii="Aptos" w:hAnsi="Aptos"/>
+                <w:b/>
+                <w:color w:val="232B34"/>
+                <w:sz w:val="16"/>
+              </w:rPr>
+              <w:t>NMEA</w:t>
+            </w:r>
+          </w:p>
+        </w:tc>
+        <w:tc>
+          <w:tcPr>
+            <w:tcW w:w="6860" w:type="dxa"/>
+            <w:tcBorders>
+              <w:top w:val="single" w:sz="6" w:space="0" w:color="D2DAE5"/>
+              <w:left w:val="single" w:sz="6" w:space="0" w:color="D2DAE5"/>
+              <w:bottom w:val="single" w:sz="6" w:space="0" w:color="D2DAE5"/>
+              <w:right w:val="single" w:sz="6" w:space="0" w:color="D2DAE5"/>
+            </w:tcBorders>
+            <w:tcMar>
+              <w:top w:w="80" w:type="dxa"/>
+              <w:left w:w="110" w:type="dxa"/>
+              <w:bottom w:w="80" w:type="dxa"/>
+              <w:right w:w="110" w:type="dxa"/>
+            </w:tcMar>
+            <w:vAlign w:val="center"/>
+          </w:tcPr>
+          <w:p>
+            <w:pPr>
+              <w:spacing w:after="0" w:line="247" w:lineRule="auto"/>
+            </w:pPr>
+            <w:r>
+              <w:rPr>
+                <w:rFonts w:ascii="Aptos" w:hAnsi="Aptos"/>
+                <w:color w:val="232B34"/>
+                <w:sz w:val="16"/>
+              </w:rPr>
+              <w:t>A marine electronics data format commonly used for navigation and AIS/GPS-style feeds; in this context it may support vessel or asset position evidence.</w:t>
+            </w:r>
+          </w:p>
+        </w:tc>
+      </w:tr>
+      <w:tr>
+        <w:trPr>
+          <w:cantSplit/>
+        </w:trPr>
+        <w:tc>
+          <w:tcPr>
+            <w:tcW w:w="2500" w:type="dxa"/>
+            <w:tcBorders>
+              <w:top w:val="single" w:sz="6" w:space="0" w:color="D2DAE5"/>
+              <w:left w:val="single" w:sz="6" w:space="0" w:color="D2DAE5"/>
+              <w:bottom w:val="single" w:sz="6" w:space="0" w:color="D2DAE5"/>
+              <w:right w:val="single" w:sz="6" w:space="0" w:color="D2DAE5"/>
+            </w:tcBorders>
+            <w:tcMar>
+              <w:top w:w="80" w:type="dxa"/>
+              <w:left w:w="110" w:type="dxa"/>
+              <w:bottom w:w="80" w:type="dxa"/>
+              <w:right w:w="110" w:type="dxa"/>
+            </w:tcMar>
+            <w:vAlign w:val="center"/>
+          </w:tcPr>
+          <w:p>
+            <w:pPr>
+              <w:spacing w:after="0" w:line="247" w:lineRule="auto"/>
+            </w:pPr>
+            <w:r>
+              <w:rPr>
+                <w:rFonts w:ascii="Aptos" w:hAnsi="Aptos"/>
+                <w:b/>
+                <w:color w:val="232B34"/>
+                <w:sz w:val="16"/>
+              </w:rPr>
+              <w:t>OPC-UA</w:t>
+            </w:r>
+          </w:p>
+        </w:tc>
+        <w:tc>
+          <w:tcPr>
+            <w:tcW w:w="6860" w:type="dxa"/>
+            <w:tcBorders>
+              <w:top w:val="single" w:sz="6" w:space="0" w:color="D2DAE5"/>
+              <w:left w:val="single" w:sz="6" w:space="0" w:color="D2DAE5"/>
+              <w:bottom w:val="single" w:sz="6" w:space="0" w:color="D2DAE5"/>
+              <w:right w:val="single" w:sz="6" w:space="0" w:color="D2DAE5"/>
+            </w:tcBorders>
+            <w:tcMar>
+              <w:top w:w="80" w:type="dxa"/>
+              <w:left w:w="110" w:type="dxa"/>
+              <w:bottom w:w="80" w:type="dxa"/>
+              <w:right w:w="110" w:type="dxa"/>
+            </w:tcMar>
+            <w:vAlign w:val="center"/>
+          </w:tcPr>
+          <w:p>
+            <w:pPr>
+              <w:spacing w:after="0" w:line="247" w:lineRule="auto"/>
+            </w:pPr>
+            <w:r>
+              <w:rPr>
+                <w:rFonts w:ascii="Aptos" w:hAnsi="Aptos"/>
+                <w:color w:val="232B34"/>
+                <w:sz w:val="16"/>
+              </w:rPr>
+              <w:t>An industrial communication standard used to exchange structured equipment, automation or plant-system data where terminal or equipment integration is required.</w:t>
+            </w:r>
+          </w:p>
+        </w:tc>
+      </w:tr>
+      <w:tr>
+        <w:trPr>
+          <w:cantSplit/>
+        </w:trPr>
+        <w:tc>
+          <w:tcPr>
+            <w:tcW w:w="2500" w:type="dxa"/>
+            <w:tcBorders>
+              <w:top w:val="single" w:sz="6" w:space="0" w:color="D2DAE5"/>
+              <w:left w:val="single" w:sz="6" w:space="0" w:color="D2DAE5"/>
+              <w:bottom w:val="single" w:sz="6" w:space="0" w:color="D2DAE5"/>
+              <w:right w:val="single" w:sz="6" w:space="0" w:color="D2DAE5"/>
+            </w:tcBorders>
+            <w:tcMar>
+              <w:top w:w="80" w:type="dxa"/>
+              <w:left w:w="110" w:type="dxa"/>
+              <w:bottom w:w="80" w:type="dxa"/>
+              <w:right w:w="110" w:type="dxa"/>
+            </w:tcMar>
+            <w:vAlign w:val="center"/>
+          </w:tcPr>
+          <w:p>
+            <w:pPr>
+              <w:spacing w:after="0" w:line="247" w:lineRule="auto"/>
+            </w:pPr>
+            <w:r>
+              <w:rPr>
+                <w:rFonts w:ascii="Aptos" w:hAnsi="Aptos"/>
+                <w:b/>
+                <w:color w:val="232B34"/>
+                <w:sz w:val="16"/>
+              </w:rPr>
+              <w:lastRenderedPageBreak/>
+              <w:t>PLC</w:t>
+            </w:r>
+          </w:p>
+        </w:tc>
+        <w:tc>
+          <w:tcPr>
+            <w:tcW w:w="6860" w:type="dxa"/>
+            <w:tcBorders>
+              <w:top w:val="single" w:sz="6" w:space="0" w:color="D2DAE5"/>
+              <w:left w:val="single" w:sz="6" w:space="0" w:color="D2DAE5"/>
+              <w:bottom w:val="single" w:sz="6" w:space="0" w:color="D2DAE5"/>
+              <w:right w:val="single" w:sz="6" w:space="0" w:color="D2DAE5"/>
+            </w:tcBorders>
+            <w:tcMar>
+              <w:top w:w="80" w:type="dxa"/>
+              <w:left w:w="110" w:type="dxa"/>
+              <w:bottom w:w="80" w:type="dxa"/>
+              <w:right w:w="110" w:type="dxa"/>
+            </w:tcMar>
+            <w:vAlign w:val="center"/>
+          </w:tcPr>
+          <w:p>
+            <w:pPr>
+              <w:spacing w:after="0" w:line="247" w:lineRule="auto"/>
+            </w:pPr>
+            <w:r>
+              <w:rPr>
+                <w:rFonts w:ascii="Aptos" w:hAnsi="Aptos"/>
+                <w:color w:val="232B34"/>
+                <w:sz w:val="16"/>
+              </w:rPr>
+              <w:t>Programmable Logic Controller; an industrial controller connected to equipment such as loaders, conveyors, bridge systems, weighbridges or terminal devices that may expose operational status or event signals.</w:t>
+            </w:r>
+          </w:p>
+        </w:tc>
+      </w:tr>
+      <w:tr>
+        <w:trPr>
+          <w:cantSplit/>
+        </w:trPr>
+        <w:tc>
+          <w:tcPr>
+            <w:tcW w:w="2500" w:type="dxa"/>
+            <w:tcBorders>
+              <w:top w:val="single" w:sz="6" w:space="0" w:color="D2DAE5"/>
+              <w:left w:val="single" w:sz="6" w:space="0" w:color="D2DAE5"/>
+              <w:bottom w:val="single" w:sz="6" w:space="0" w:color="D2DAE5"/>
+              <w:right w:val="single" w:sz="6" w:space="0" w:color="D2DAE5"/>
+            </w:tcBorders>
+            <w:tcMar>
+              <w:top w:w="80" w:type="dxa"/>
+              <w:left w:w="110" w:type="dxa"/>
+              <w:bottom w:w="80" w:type="dxa"/>
+              <w:right w:w="110" w:type="dxa"/>
+            </w:tcMar>
+            <w:vAlign w:val="center"/>
+          </w:tcPr>
+          <w:p>
+            <w:pPr>
+              <w:spacing w:after="0" w:line="247" w:lineRule="auto"/>
+            </w:pPr>
+            <w:r>
+              <w:rPr>
+                <w:rFonts w:ascii="Aptos" w:hAnsi="Aptos"/>
+                <w:b/>
+                <w:color w:val="232B34"/>
+                <w:sz w:val="16"/>
+              </w:rPr>
+              <w:t>Operator console</w:t>
+            </w:r>
+          </w:p>
+        </w:tc>
+        <w:tc>
+          <w:tcPr>
+            <w:tcW w:w="6860" w:type="dxa"/>
+            <w:tcBorders>
+              <w:top w:val="single" w:sz="6" w:space="0" w:color="D2DAE5"/>
+              <w:left w:val="single" w:sz="6" w:space="0" w:color="D2DAE5"/>
+              <w:bottom w:val="single" w:sz="6" w:space="0" w:color="D2DAE5"/>
+              <w:right w:val="single" w:sz="6" w:space="0" w:color="D2DAE5"/>
+            </w:tcBorders>
+            <w:tcMar>
+              <w:top w:w="80" w:type="dxa"/>
+              <w:left w:w="110" w:type="dxa"/>
+              <w:bottom w:w="80" w:type="dxa"/>
+              <w:right w:w="110" w:type="dxa"/>
+            </w:tcMar>
+            <w:vAlign w:val="center"/>
+          </w:tcPr>
+          <w:p>
+            <w:pPr>
+              <w:spacing w:after="0" w:line="247" w:lineRule="auto"/>
+            </w:pPr>
+            <w:r>
+              <w:rPr>
+                <w:rFonts w:ascii="Aptos" w:hAnsi="Aptos"/>
+                <w:color w:val="232B34"/>
+                <w:sz w:val="16"/>
+              </w:rPr>
+              <w:t>A human-operated terminal or operational screen used by field, jetty, bridge, CTS or terminal teams to enter status updates, confirmations, downtime, window changes or operating events.</w:t>
+            </w:r>
+          </w:p>
+        </w:tc>
+      </w:tr>
+    </w:tbl>
+    <w:p>
+      <w:pPr>
+        <w:spacing w:before="140" w:after="0"/>
+      </w:pPr>
+      <w:r>
+        <w:rPr>
+          <w:rFonts w:ascii="Aptos" w:hAnsi="Aptos"/>
+          <w:color w:val="58626E"/>
+          <w:sz w:val="16"/>
+        </w:rPr>
+        <w:t>Glossary entries are scoped to this proposal extension and should be aligned with final ABL-Berau master-data naming during implementation.</w:t>
       </w:r>
     </w:p>
     <w:sectPr>

</xml_diff>